<commit_message>
arquitectura docker completa levantada
</commit_message>
<xml_diff>
--- a/Explicacion_Microservicios.docx
+++ b/Explicacion_Microservicios.docx
@@ -919,11 +919,1983 @@
     </w:p>
     <w:p>
       <w:pPr>
-        <w:rPr>
-          <w:lang w:val="es-MX"/>
-        </w:rPr>
-      </w:pPr>
+        <w:pStyle w:val="Ttulo3"/>
+        <w:rPr>
+          <w:lang w:val="es-MX"/>
+        </w:rPr>
+      </w:pPr>
+      <w:r>
+        <w:rPr>
+          <w:lang w:val="es-MX"/>
+        </w:rPr>
+        <w:t>Qué hace cada línea — memoriza esto para tu defensa</w:t>
+      </w:r>
+    </w:p>
+    <w:p>
+      <w:pPr>
+        <w:pStyle w:val="font-claude-response-body"/>
+        <w:rPr>
+          <w:lang w:val="es-MX"/>
+        </w:rPr>
+      </w:pPr>
+      <w:proofErr w:type="spellStart"/>
+      <w:r>
+        <w:rPr>
+          <w:rStyle w:val="CdigoHTML"/>
+          <w:lang w:val="es-MX"/>
+        </w:rPr>
+        <w:t>require</w:t>
+      </w:r>
+      <w:proofErr w:type="spellEnd"/>
+      <w:r>
+        <w:rPr>
+          <w:rStyle w:val="CdigoHTML"/>
+          <w:lang w:val="es-MX"/>
+        </w:rPr>
+        <w:t>('</w:t>
+      </w:r>
+      <w:proofErr w:type="spellStart"/>
+      <w:r>
+        <w:rPr>
+          <w:rStyle w:val="CdigoHTML"/>
+          <w:lang w:val="es-MX"/>
+        </w:rPr>
+        <w:t>express</w:t>
+      </w:r>
+      <w:proofErr w:type="spellEnd"/>
+      <w:r>
+        <w:rPr>
+          <w:rStyle w:val="CdigoHTML"/>
+          <w:lang w:val="es-MX"/>
+        </w:rPr>
+        <w:t>')</w:t>
+      </w:r>
+      <w:r>
+        <w:rPr>
+          <w:lang w:val="es-MX"/>
+        </w:rPr>
+        <w:t xml:space="preserve"> — importa el </w:t>
+      </w:r>
+      <w:proofErr w:type="spellStart"/>
+      <w:r>
+        <w:rPr>
+          <w:lang w:val="es-MX"/>
+        </w:rPr>
+        <w:t>framework</w:t>
+      </w:r>
+      <w:proofErr w:type="spellEnd"/>
+      <w:r>
+        <w:rPr>
+          <w:lang w:val="es-MX"/>
+        </w:rPr>
+        <w:t xml:space="preserve"> Express que instalaste. Es como "abrir" la librería para usarla.</w:t>
+      </w:r>
+    </w:p>
+    <w:p>
+      <w:pPr>
+        <w:pStyle w:val="font-claude-response-body"/>
+        <w:rPr>
+          <w:lang w:val="es-MX"/>
+        </w:rPr>
+      </w:pPr>
+      <w:proofErr w:type="spellStart"/>
+      <w:r>
+        <w:rPr>
+          <w:rStyle w:val="CdigoHTML"/>
+          <w:lang w:val="es-MX"/>
+        </w:rPr>
+        <w:t>require</w:t>
+      </w:r>
+      <w:proofErr w:type="spellEnd"/>
+      <w:r>
+        <w:rPr>
+          <w:rStyle w:val="CdigoHTML"/>
+          <w:lang w:val="es-MX"/>
+        </w:rPr>
+        <w:t>('</w:t>
+      </w:r>
+      <w:proofErr w:type="spellStart"/>
+      <w:r>
+        <w:rPr>
+          <w:rStyle w:val="CdigoHTML"/>
+          <w:lang w:val="es-MX"/>
+        </w:rPr>
+        <w:t>dotenv</w:t>
+      </w:r>
+      <w:proofErr w:type="spellEnd"/>
+      <w:r>
+        <w:rPr>
+          <w:rStyle w:val="CdigoHTML"/>
+          <w:lang w:val="es-MX"/>
+        </w:rPr>
+        <w:t>')</w:t>
+      </w:r>
+      <w:r>
+        <w:rPr>
+          <w:lang w:val="es-MX"/>
+        </w:rPr>
+        <w:t xml:space="preserve"> — importa la librería que lee tu </w:t>
+      </w:r>
+      <w:proofErr w:type="gramStart"/>
+      <w:r>
+        <w:rPr>
+          <w:lang w:val="es-MX"/>
+        </w:rPr>
+        <w:t xml:space="preserve">archivo </w:t>
+      </w:r>
+      <w:r>
+        <w:rPr>
+          <w:rStyle w:val="CdigoHTML"/>
+          <w:lang w:val="es-MX"/>
+        </w:rPr>
+        <w:t>.</w:t>
+      </w:r>
+      <w:proofErr w:type="spellStart"/>
+      <w:r>
+        <w:rPr>
+          <w:rStyle w:val="CdigoHTML"/>
+          <w:lang w:val="es-MX"/>
+        </w:rPr>
+        <w:t>env</w:t>
+      </w:r>
+      <w:proofErr w:type="spellEnd"/>
+      <w:proofErr w:type="gramEnd"/>
+      <w:r>
+        <w:rPr>
+          <w:lang w:val="es-MX"/>
+        </w:rPr>
+        <w:t>.</w:t>
+      </w:r>
+    </w:p>
+    <w:p>
+      <w:pPr>
+        <w:pStyle w:val="font-claude-response-body"/>
+        <w:rPr>
+          <w:lang w:val="es-MX"/>
+        </w:rPr>
+      </w:pPr>
+      <w:proofErr w:type="spellStart"/>
+      <w:r>
+        <w:rPr>
+          <w:rStyle w:val="CdigoHTML"/>
+          <w:lang w:val="es-MX"/>
+        </w:rPr>
+        <w:t>dotenv.</w:t>
+      </w:r>
+      <w:proofErr w:type="gramStart"/>
+      <w:r>
+        <w:rPr>
+          <w:rStyle w:val="CdigoHTML"/>
+          <w:lang w:val="es-MX"/>
+        </w:rPr>
+        <w:t>config</w:t>
+      </w:r>
+      <w:proofErr w:type="spellEnd"/>
+      <w:r>
+        <w:rPr>
+          <w:rStyle w:val="CdigoHTML"/>
+          <w:lang w:val="es-MX"/>
+        </w:rPr>
+        <w:t>(</w:t>
+      </w:r>
+      <w:proofErr w:type="gramEnd"/>
+      <w:r>
+        <w:rPr>
+          <w:rStyle w:val="CdigoHTML"/>
+          <w:lang w:val="es-MX"/>
+        </w:rPr>
+        <w:t>)</w:t>
+      </w:r>
+      <w:r>
+        <w:rPr>
+          <w:lang w:val="es-MX"/>
+        </w:rPr>
+        <w:t xml:space="preserve"> — ejecuta la lectura del </w:t>
+      </w:r>
+      <w:r>
+        <w:rPr>
+          <w:rStyle w:val="CdigoHTML"/>
+          <w:lang w:val="es-MX"/>
+        </w:rPr>
+        <w:t>.</w:t>
+      </w:r>
+      <w:proofErr w:type="spellStart"/>
+      <w:r>
+        <w:rPr>
+          <w:rStyle w:val="CdigoHTML"/>
+          <w:lang w:val="es-MX"/>
+        </w:rPr>
+        <w:t>env</w:t>
+      </w:r>
+      <w:proofErr w:type="spellEnd"/>
+      <w:r>
+        <w:rPr>
+          <w:lang w:val="es-MX"/>
+        </w:rPr>
+        <w:t xml:space="preserve"> y carga todas las variables en </w:t>
+      </w:r>
+      <w:proofErr w:type="spellStart"/>
+      <w:r>
+        <w:rPr>
+          <w:rStyle w:val="CdigoHTML"/>
+          <w:lang w:val="es-MX"/>
+        </w:rPr>
+        <w:t>process.env</w:t>
+      </w:r>
+      <w:proofErr w:type="spellEnd"/>
+      <w:r>
+        <w:rPr>
+          <w:lang w:val="es-MX"/>
+        </w:rPr>
+        <w:t>. Debe ir antes de cualquier cosa que use variables de entorno.</w:t>
+      </w:r>
+    </w:p>
+    <w:p>
+      <w:pPr>
+        <w:pStyle w:val="font-claude-response-body"/>
+        <w:rPr>
+          <w:lang w:val="es-MX"/>
+        </w:rPr>
+      </w:pPr>
+      <w:proofErr w:type="spellStart"/>
+      <w:r>
+        <w:rPr>
+          <w:rStyle w:val="CdigoHTML"/>
+          <w:lang w:val="es-MX"/>
+        </w:rPr>
+        <w:t>const</w:t>
+      </w:r>
+      <w:proofErr w:type="spellEnd"/>
+      <w:r>
+        <w:rPr>
+          <w:rStyle w:val="CdigoHTML"/>
+          <w:lang w:val="es-MX"/>
+        </w:rPr>
+        <w:t xml:space="preserve"> app = </w:t>
+      </w:r>
+      <w:proofErr w:type="spellStart"/>
+      <w:proofErr w:type="gramStart"/>
+      <w:r>
+        <w:rPr>
+          <w:rStyle w:val="CdigoHTML"/>
+          <w:lang w:val="es-MX"/>
+        </w:rPr>
+        <w:t>express</w:t>
+      </w:r>
+      <w:proofErr w:type="spellEnd"/>
+      <w:r>
+        <w:rPr>
+          <w:rStyle w:val="CdigoHTML"/>
+          <w:lang w:val="es-MX"/>
+        </w:rPr>
+        <w:t>(</w:t>
+      </w:r>
+      <w:proofErr w:type="gramEnd"/>
+      <w:r>
+        <w:rPr>
+          <w:rStyle w:val="CdigoHTML"/>
+          <w:lang w:val="es-MX"/>
+        </w:rPr>
+        <w:t>)</w:t>
+      </w:r>
+      <w:r>
+        <w:rPr>
+          <w:lang w:val="es-MX"/>
+        </w:rPr>
+        <w:t xml:space="preserve"> — crea tu aplicación web. Todo el sistema arranca desde esta línea.</w:t>
+      </w:r>
+    </w:p>
+    <w:p>
+      <w:pPr>
+        <w:pStyle w:val="font-claude-response-body"/>
+        <w:rPr>
+          <w:lang w:val="es-MX"/>
+        </w:rPr>
+      </w:pPr>
+      <w:proofErr w:type="spellStart"/>
+      <w:r>
+        <w:rPr>
+          <w:rStyle w:val="CdigoHTML"/>
+          <w:lang w:val="es-MX"/>
+        </w:rPr>
+        <w:t>app.use</w:t>
+      </w:r>
+      <w:proofErr w:type="spellEnd"/>
+      <w:r>
+        <w:rPr>
+          <w:rStyle w:val="CdigoHTML"/>
+          <w:lang w:val="es-MX"/>
+        </w:rPr>
+        <w:t>(</w:t>
+      </w:r>
+      <w:proofErr w:type="spellStart"/>
+      <w:proofErr w:type="gramStart"/>
+      <w:r>
+        <w:rPr>
+          <w:rStyle w:val="CdigoHTML"/>
+          <w:lang w:val="es-MX"/>
+        </w:rPr>
+        <w:t>express.json</w:t>
+      </w:r>
+      <w:proofErr w:type="spellEnd"/>
+      <w:proofErr w:type="gramEnd"/>
+      <w:r>
+        <w:rPr>
+          <w:rStyle w:val="CdigoHTML"/>
+          <w:lang w:val="es-MX"/>
+        </w:rPr>
+        <w:t>())</w:t>
+      </w:r>
+      <w:r>
+        <w:rPr>
+          <w:lang w:val="es-MX"/>
+        </w:rPr>
+        <w:t xml:space="preserve"> — le dice a Express que entienda JSON. Sin esto, cuando la app móvil envíe datos en formato JSON, tu servidor no los podría leer.</w:t>
+      </w:r>
+    </w:p>
+    <w:p>
+      <w:pPr>
+        <w:pStyle w:val="font-claude-response-body"/>
+        <w:rPr>
+          <w:lang w:val="es-MX"/>
+        </w:rPr>
+      </w:pPr>
+      <w:proofErr w:type="spellStart"/>
+      <w:proofErr w:type="gramStart"/>
+      <w:r>
+        <w:rPr>
+          <w:rStyle w:val="CdigoHTML"/>
+          <w:lang w:val="es-MX"/>
+        </w:rPr>
+        <w:t>app.get</w:t>
+      </w:r>
+      <w:proofErr w:type="spellEnd"/>
+      <w:r>
+        <w:rPr>
+          <w:rStyle w:val="CdigoHTML"/>
+          <w:lang w:val="es-MX"/>
+        </w:rPr>
+        <w:t>(</w:t>
+      </w:r>
+      <w:proofErr w:type="gramEnd"/>
+      <w:r>
+        <w:rPr>
+          <w:rStyle w:val="CdigoHTML"/>
+          <w:lang w:val="es-MX"/>
+        </w:rPr>
+        <w:t>'/</w:t>
+      </w:r>
+      <w:proofErr w:type="spellStart"/>
+      <w:r>
+        <w:rPr>
+          <w:rStyle w:val="CdigoHTML"/>
+          <w:lang w:val="es-MX"/>
+        </w:rPr>
+        <w:t>health</w:t>
+      </w:r>
+      <w:proofErr w:type="spellEnd"/>
+      <w:r>
+        <w:rPr>
+          <w:rStyle w:val="CdigoHTML"/>
+          <w:lang w:val="es-MX"/>
+        </w:rPr>
+        <w:t>', ...)</w:t>
+      </w:r>
+      <w:r>
+        <w:rPr>
+          <w:lang w:val="es-MX"/>
+        </w:rPr>
+        <w:t xml:space="preserve"> — crea una ruta de prueba. Cuando alguien visita </w:t>
+      </w:r>
+      <w:r>
+        <w:rPr>
+          <w:rStyle w:val="CdigoHTML"/>
+          <w:lang w:val="es-MX"/>
+        </w:rPr>
+        <w:t>/</w:t>
+      </w:r>
+      <w:proofErr w:type="spellStart"/>
+      <w:r>
+        <w:rPr>
+          <w:rStyle w:val="CdigoHTML"/>
+          <w:lang w:val="es-MX"/>
+        </w:rPr>
+        <w:t>health</w:t>
+      </w:r>
+      <w:proofErr w:type="spellEnd"/>
+      <w:r>
+        <w:rPr>
+          <w:lang w:val="es-MX"/>
+        </w:rPr>
+        <w:t xml:space="preserve">, el servidor responde que está vivo. Es una práctica estándar en </w:t>
+      </w:r>
+      <w:proofErr w:type="spellStart"/>
+      <w:r>
+        <w:rPr>
+          <w:lang w:val="es-MX"/>
+        </w:rPr>
+        <w:t>microservicios</w:t>
+      </w:r>
+      <w:proofErr w:type="spellEnd"/>
+      <w:r>
+        <w:rPr>
+          <w:lang w:val="es-MX"/>
+        </w:rPr>
+        <w:t xml:space="preserve"> para verificar que el servicio funciona.</w:t>
+      </w:r>
+    </w:p>
+    <w:p>
+      <w:pPr>
+        <w:pStyle w:val="font-claude-response-body"/>
+        <w:rPr>
+          <w:lang w:val="es-MX"/>
+        </w:rPr>
+      </w:pPr>
+      <w:proofErr w:type="spellStart"/>
+      <w:proofErr w:type="gramStart"/>
+      <w:r>
+        <w:rPr>
+          <w:rStyle w:val="CdigoHTML"/>
+          <w:lang w:val="es-MX"/>
+        </w:rPr>
+        <w:t>process.env.PORT</w:t>
+      </w:r>
+      <w:proofErr w:type="spellEnd"/>
+      <w:proofErr w:type="gramEnd"/>
+      <w:r>
+        <w:rPr>
+          <w:rStyle w:val="CdigoHTML"/>
+          <w:lang w:val="es-MX"/>
+        </w:rPr>
+        <w:t xml:space="preserve"> || 3001</w:t>
+      </w:r>
+      <w:r>
+        <w:rPr>
+          <w:lang w:val="es-MX"/>
+        </w:rPr>
+        <w:t xml:space="preserve"> — lee el puerto del </w:t>
+      </w:r>
+      <w:r>
+        <w:rPr>
+          <w:rStyle w:val="CdigoHTML"/>
+          <w:lang w:val="es-MX"/>
+        </w:rPr>
+        <w:t>.</w:t>
+      </w:r>
+      <w:proofErr w:type="spellStart"/>
+      <w:r>
+        <w:rPr>
+          <w:rStyle w:val="CdigoHTML"/>
+          <w:lang w:val="es-MX"/>
+        </w:rPr>
+        <w:t>env</w:t>
+      </w:r>
+      <w:proofErr w:type="spellEnd"/>
+      <w:r>
+        <w:rPr>
+          <w:lang w:val="es-MX"/>
+        </w:rPr>
+        <w:t xml:space="preserve">. Si no existe, usa 3001 por defecto. El </w:t>
+      </w:r>
+      <w:r>
+        <w:rPr>
+          <w:rStyle w:val="CdigoHTML"/>
+          <w:lang w:val="es-MX"/>
+        </w:rPr>
+        <w:t>||</w:t>
+      </w:r>
+      <w:r>
+        <w:rPr>
+          <w:lang w:val="es-MX"/>
+        </w:rPr>
+        <w:t xml:space="preserve"> significa "o si no".</w:t>
+      </w:r>
+    </w:p>
+    <w:p>
+      <w:pPr>
+        <w:pStyle w:val="font-claude-response-body"/>
+        <w:rPr>
+          <w:lang w:val="es-MX"/>
+        </w:rPr>
+      </w:pPr>
+      <w:proofErr w:type="spellStart"/>
+      <w:proofErr w:type="gramStart"/>
+      <w:r>
+        <w:rPr>
+          <w:rStyle w:val="CdigoHTML"/>
+          <w:lang w:val="es-MX"/>
+        </w:rPr>
+        <w:t>app.listen</w:t>
+      </w:r>
+      <w:proofErr w:type="spellEnd"/>
+      <w:proofErr w:type="gramEnd"/>
+      <w:r>
+        <w:rPr>
+          <w:rStyle w:val="CdigoHTML"/>
+          <w:lang w:val="es-MX"/>
+        </w:rPr>
+        <w:t>(PORT, ...)</w:t>
+      </w:r>
+      <w:r>
+        <w:rPr>
+          <w:lang w:val="es-MX"/>
+        </w:rPr>
+        <w:t xml:space="preserve"> — arranca el servidor y se queda escuchando peticiones en ese puerto.</w:t>
+      </w:r>
+    </w:p>
+    <w:p>
+      <w:pPr>
+        <w:pStyle w:val="Ttulo3"/>
+        <w:rPr>
+          <w:lang w:val="es-MX"/>
+        </w:rPr>
+      </w:pPr>
+      <w:r>
+        <w:rPr>
+          <w:lang w:val="es-MX"/>
+        </w:rPr>
+        <w:t>Qué hace cada parte</w:t>
+      </w:r>
+    </w:p>
+    <w:p>
+      <w:pPr>
+        <w:pStyle w:val="font-claude-response-body"/>
+        <w:rPr>
+          <w:lang w:val="es-MX"/>
+        </w:rPr>
+      </w:pPr>
+      <w:r>
+        <w:rPr>
+          <w:rStyle w:val="CdigoHTML"/>
+          <w:lang w:val="es-MX"/>
+        </w:rPr>
+        <w:lastRenderedPageBreak/>
+        <w:t>Pool</w:t>
+      </w:r>
+      <w:r>
+        <w:rPr>
+          <w:lang w:val="es-MX"/>
+        </w:rPr>
+        <w:t xml:space="preserve"> — en lugar de abrir y cerrar una conexión cada vez que alguien hace </w:t>
+      </w:r>
+      <w:proofErr w:type="spellStart"/>
+      <w:r>
+        <w:rPr>
+          <w:lang w:val="es-MX"/>
+        </w:rPr>
+        <w:t>login</w:t>
+      </w:r>
+      <w:proofErr w:type="spellEnd"/>
+      <w:r>
+        <w:rPr>
+          <w:lang w:val="es-MX"/>
+        </w:rPr>
+        <w:t>, un Pool mantiene varias conexiones abiertas y las reutiliza. Es mucho más eficiente.</w:t>
+      </w:r>
+    </w:p>
+    <w:p>
+      <w:pPr>
+        <w:pStyle w:val="font-claude-response-body"/>
+        <w:rPr>
+          <w:lang w:val="es-MX"/>
+        </w:rPr>
+      </w:pPr>
+      <w:proofErr w:type="spellStart"/>
+      <w:r>
+        <w:rPr>
+          <w:rStyle w:val="CdigoHTML"/>
+          <w:lang w:val="es-MX"/>
+        </w:rPr>
+        <w:t>process.env.DB_HOST</w:t>
+      </w:r>
+      <w:proofErr w:type="spellEnd"/>
+      <w:r>
+        <w:rPr>
+          <w:rStyle w:val="CdigoHTML"/>
+          <w:lang w:val="es-MX"/>
+        </w:rPr>
+        <w:t xml:space="preserve"> || '</w:t>
+      </w:r>
+      <w:proofErr w:type="spellStart"/>
+      <w:r>
+        <w:rPr>
+          <w:rStyle w:val="CdigoHTML"/>
+          <w:lang w:val="es-MX"/>
+        </w:rPr>
+        <w:t>localhost</w:t>
+      </w:r>
+      <w:proofErr w:type="spellEnd"/>
+      <w:r>
+        <w:rPr>
+          <w:rStyle w:val="CdigoHTML"/>
+          <w:lang w:val="es-MX"/>
+        </w:rPr>
+        <w:t>'</w:t>
+      </w:r>
+      <w:r>
+        <w:rPr>
+          <w:lang w:val="es-MX"/>
+        </w:rPr>
+        <w:t xml:space="preserve"> — intenta leer </w:t>
+      </w:r>
+      <w:proofErr w:type="gramStart"/>
+      <w:r>
+        <w:rPr>
+          <w:lang w:val="es-MX"/>
+        </w:rPr>
+        <w:t xml:space="preserve">del </w:t>
+      </w:r>
+      <w:r>
+        <w:rPr>
+          <w:rStyle w:val="CdigoHTML"/>
+          <w:lang w:val="es-MX"/>
+        </w:rPr>
+        <w:t>.</w:t>
+      </w:r>
+      <w:proofErr w:type="spellStart"/>
+      <w:r>
+        <w:rPr>
+          <w:rStyle w:val="CdigoHTML"/>
+          <w:lang w:val="es-MX"/>
+        </w:rPr>
+        <w:t>env</w:t>
+      </w:r>
+      <w:proofErr w:type="spellEnd"/>
+      <w:proofErr w:type="gramEnd"/>
+      <w:r>
+        <w:rPr>
+          <w:lang w:val="es-MX"/>
+        </w:rPr>
+        <w:t xml:space="preserve">, y si no existe usa </w:t>
+      </w:r>
+      <w:proofErr w:type="spellStart"/>
+      <w:r>
+        <w:rPr>
+          <w:rStyle w:val="CdigoHTML"/>
+          <w:lang w:val="es-MX"/>
+        </w:rPr>
+        <w:t>localhost</w:t>
+      </w:r>
+      <w:proofErr w:type="spellEnd"/>
+      <w:r>
+        <w:rPr>
+          <w:lang w:val="es-MX"/>
+        </w:rPr>
+        <w:t xml:space="preserve"> como valor por defecto. Esto se llama </w:t>
+      </w:r>
+      <w:r>
+        <w:rPr>
+          <w:rStyle w:val="Textoennegrita"/>
+          <w:lang w:val="es-MX"/>
+        </w:rPr>
+        <w:t>valor de respaldo</w:t>
+      </w:r>
+      <w:r>
+        <w:rPr>
+          <w:lang w:val="es-MX"/>
+        </w:rPr>
+        <w:t xml:space="preserve"> y es una buena práctica.</w:t>
+      </w:r>
+    </w:p>
+    <w:p>
+      <w:pPr>
+        <w:pStyle w:val="font-claude-response-body"/>
+        <w:rPr>
+          <w:lang w:val="es-MX"/>
+        </w:rPr>
+      </w:pPr>
+      <w:proofErr w:type="spellStart"/>
+      <w:proofErr w:type="gramStart"/>
+      <w:r>
+        <w:rPr>
+          <w:rStyle w:val="CdigoHTML"/>
+          <w:lang w:val="es-MX"/>
+        </w:rPr>
+        <w:t>pool.on</w:t>
+      </w:r>
+      <w:proofErr w:type="spellEnd"/>
+      <w:proofErr w:type="gramEnd"/>
+      <w:r>
+        <w:rPr>
+          <w:rStyle w:val="CdigoHTML"/>
+          <w:lang w:val="es-MX"/>
+        </w:rPr>
+        <w:t>('</w:t>
+      </w:r>
+      <w:proofErr w:type="spellStart"/>
+      <w:r>
+        <w:rPr>
+          <w:rStyle w:val="CdigoHTML"/>
+          <w:lang w:val="es-MX"/>
+        </w:rPr>
+        <w:t>connect</w:t>
+      </w:r>
+      <w:proofErr w:type="spellEnd"/>
+      <w:r>
+        <w:rPr>
+          <w:rStyle w:val="CdigoHTML"/>
+          <w:lang w:val="es-MX"/>
+        </w:rPr>
+        <w:t>', ...)</w:t>
+      </w:r>
+      <w:r>
+        <w:rPr>
+          <w:lang w:val="es-MX"/>
+        </w:rPr>
+        <w:t xml:space="preserve"> — cada vez que se establece una conexión nueva con </w:t>
+      </w:r>
+      <w:proofErr w:type="spellStart"/>
+      <w:r>
+        <w:rPr>
+          <w:lang w:val="es-MX"/>
+        </w:rPr>
+        <w:t>PostgreSQL</w:t>
+      </w:r>
+      <w:proofErr w:type="spellEnd"/>
+      <w:r>
+        <w:rPr>
+          <w:lang w:val="es-MX"/>
+        </w:rPr>
+        <w:t>, imprime un mensaje. Te ayuda a saber que la base de datos está respondiendo.</w:t>
+      </w:r>
+    </w:p>
+    <w:p>
+      <w:pPr>
+        <w:pStyle w:val="font-claude-response-body"/>
+        <w:rPr>
+          <w:lang w:val="es-MX"/>
+        </w:rPr>
+      </w:pPr>
+      <w:proofErr w:type="spellStart"/>
+      <w:proofErr w:type="gramStart"/>
+      <w:r>
+        <w:rPr>
+          <w:rStyle w:val="CdigoHTML"/>
+          <w:lang w:val="es-MX"/>
+        </w:rPr>
+        <w:t>pool.on</w:t>
+      </w:r>
+      <w:proofErr w:type="spellEnd"/>
+      <w:proofErr w:type="gramEnd"/>
+      <w:r>
+        <w:rPr>
+          <w:rStyle w:val="CdigoHTML"/>
+          <w:lang w:val="es-MX"/>
+        </w:rPr>
+        <w:t>('error', ...)</w:t>
+      </w:r>
+      <w:r>
+        <w:rPr>
+          <w:lang w:val="es-MX"/>
+        </w:rPr>
+        <w:t xml:space="preserve"> — si </w:t>
+      </w:r>
+      <w:proofErr w:type="spellStart"/>
+      <w:r>
+        <w:rPr>
+          <w:lang w:val="es-MX"/>
+        </w:rPr>
+        <w:t>PostgreSQL</w:t>
+      </w:r>
+      <w:proofErr w:type="spellEnd"/>
+      <w:r>
+        <w:rPr>
+          <w:lang w:val="es-MX"/>
+        </w:rPr>
+        <w:t xml:space="preserve"> se cae o hay un problema, captura el error y lo muestra en consola en lugar de que el servidor explote silenciosamente.</w:t>
+      </w:r>
+    </w:p>
+    <w:p>
+      <w:pPr>
+        <w:pStyle w:val="font-claude-response-body"/>
+        <w:rPr>
+          <w:lang w:val="es-MX"/>
+        </w:rPr>
+      </w:pPr>
+      <w:proofErr w:type="spellStart"/>
+      <w:proofErr w:type="gramStart"/>
+      <w:r>
+        <w:rPr>
+          <w:rStyle w:val="CdigoHTML"/>
+          <w:lang w:val="es-MX"/>
+        </w:rPr>
+        <w:t>module.exports</w:t>
+      </w:r>
+      <w:proofErr w:type="spellEnd"/>
+      <w:proofErr w:type="gramEnd"/>
+      <w:r>
+        <w:rPr>
+          <w:rStyle w:val="CdigoHTML"/>
+          <w:lang w:val="es-MX"/>
+        </w:rPr>
+        <w:t xml:space="preserve"> = pool</w:t>
+      </w:r>
+      <w:r>
+        <w:rPr>
+          <w:lang w:val="es-MX"/>
+        </w:rPr>
+        <w:t xml:space="preserve"> — exporta el pool para que otros archivos lo puedan importar con </w:t>
+      </w:r>
+      <w:proofErr w:type="spellStart"/>
+      <w:r>
+        <w:rPr>
+          <w:rStyle w:val="CdigoHTML"/>
+          <w:lang w:val="es-MX"/>
+        </w:rPr>
+        <w:t>require</w:t>
+      </w:r>
+      <w:proofErr w:type="spellEnd"/>
+      <w:r>
+        <w:rPr>
+          <w:lang w:val="es-MX"/>
+        </w:rPr>
+        <w:t>.</w:t>
+      </w:r>
+    </w:p>
+    <w:p>
+      <w:pPr>
+        <w:rPr>
+          <w:lang w:val="es-MX"/>
+        </w:rPr>
+      </w:pPr>
+    </w:p>
+    <w:p>
+      <w:pPr>
+        <w:rPr>
+          <w:lang w:val="es-MX"/>
+        </w:rPr>
+      </w:pPr>
+      <w:r>
+        <w:rPr>
+          <w:lang w:val="es-MX"/>
+        </w:rPr>
+        <w:t xml:space="preserve">Necesito hacer una APP que contenga una IA que funcione offline que sirva para recibir historias clínicas de un consultorio optometrista, cuando tenga conexión deberá sincronizar con una base de datos que ya tengo configurada en Mongo Atlas. Me vas a explicar paso por paso porque es para mi tesis y necesito saber TODO y auditar todo. Me ayudas a fabricar el código y me explicas línea por línea dándome maneras creativas de realizar para que yo pueda aprender y asimismo aprobar. Necesito también subir este proyecto cada progreso que haga al </w:t>
+      </w:r>
+      <w:proofErr w:type="spellStart"/>
+      <w:r>
+        <w:rPr>
+          <w:lang w:val="es-MX"/>
+        </w:rPr>
+        <w:t>github</w:t>
+      </w:r>
+      <w:proofErr w:type="spellEnd"/>
+      <w:r>
+        <w:rPr>
+          <w:lang w:val="es-MX"/>
+        </w:rPr>
+        <w:t>. Aquí te paso los requerimientos para trabajar:</w:t>
+      </w:r>
+    </w:p>
+    <w:p>
+      <w:pPr>
+        <w:rPr>
+          <w:b/>
+          <w:bCs/>
+          <w:lang w:val="es-MX"/>
+        </w:rPr>
+      </w:pPr>
+      <w:r>
+        <w:rPr>
+          <w:b/>
+          <w:bCs/>
+          <w:lang w:val="es-MX"/>
+        </w:rPr>
+        <w:t>Fase 1: Estructura del Proyecto y Orquestación (</w:t>
+      </w:r>
+      <w:proofErr w:type="spellStart"/>
+      <w:r>
+        <w:rPr>
+          <w:b/>
+          <w:bCs/>
+          <w:lang w:val="es-MX"/>
+        </w:rPr>
+        <w:t>Docker</w:t>
+      </w:r>
+      <w:proofErr w:type="spellEnd"/>
+      <w:r>
+        <w:rPr>
+          <w:b/>
+          <w:bCs/>
+          <w:lang w:val="es-MX"/>
+        </w:rPr>
+        <w:t>)</w:t>
+      </w:r>
+    </w:p>
+    <w:p>
+      <w:pPr>
+        <w:rPr>
+          <w:lang w:val="es-MX"/>
+        </w:rPr>
+      </w:pPr>
+      <w:r>
+        <w:rPr>
+          <w:lang w:val="es-MX"/>
+        </w:rPr>
+        <w:t>El primer paso es definir l</w:t>
+      </w:r>
+      <w:r>
+        <w:rPr>
+          <w:lang w:val="es-MX"/>
+        </w:rPr>
+        <w:t>a jerarquía de carpetas para los</w:t>
+      </w:r>
+      <w:r>
+        <w:rPr>
+          <w:lang w:val="es-MX"/>
+        </w:rPr>
+        <w:t xml:space="preserve"> </w:t>
+      </w:r>
+      <w:proofErr w:type="spellStart"/>
+      <w:r>
+        <w:rPr>
+          <w:lang w:val="es-MX"/>
+        </w:rPr>
+        <w:t>microservicios</w:t>
+      </w:r>
+      <w:proofErr w:type="spellEnd"/>
+      <w:r>
+        <w:rPr>
+          <w:lang w:val="es-MX"/>
+        </w:rPr>
+        <w:t xml:space="preserve"> desacoplados.</w:t>
+      </w:r>
+    </w:p>
+    <w:p>
+      <w:pPr>
+        <w:numPr>
+          <w:ilvl w:val="0"/>
+          <w:numId w:val="5"/>
+        </w:numPr>
+      </w:pPr>
+      <w:proofErr w:type="spellStart"/>
+      <w:r>
+        <w:rPr>
+          <w:b/>
+          <w:bCs/>
+        </w:rPr>
+        <w:t>Directorio</w:t>
+      </w:r>
+      <w:proofErr w:type="spellEnd"/>
+      <w:r>
+        <w:rPr>
+          <w:b/>
+          <w:bCs/>
+        </w:rPr>
+        <w:t xml:space="preserve"> </w:t>
+      </w:r>
+      <w:proofErr w:type="spellStart"/>
+      <w:r>
+        <w:rPr>
+          <w:b/>
+          <w:bCs/>
+        </w:rPr>
+        <w:t>Raíz</w:t>
+      </w:r>
+      <w:proofErr w:type="spellEnd"/>
+      <w:r>
+        <w:rPr>
+          <w:b/>
+          <w:bCs/>
+        </w:rPr>
+        <w:t xml:space="preserve"> (/</w:t>
+      </w:r>
+      <w:proofErr w:type="spellStart"/>
+      <w:r>
+        <w:rPr>
+          <w:b/>
+          <w:bCs/>
+        </w:rPr>
+        <w:t>Athenea_Project</w:t>
+      </w:r>
+      <w:proofErr w:type="spellEnd"/>
+      <w:r>
+        <w:rPr>
+          <w:b/>
+          <w:bCs/>
+        </w:rPr>
+        <w:t>):</w:t>
+      </w:r>
+    </w:p>
+    <w:p>
+      <w:pPr>
+        <w:numPr>
+          <w:ilvl w:val="1"/>
+          <w:numId w:val="5"/>
+        </w:numPr>
+        <w:rPr>
+          <w:lang w:val="es-MX"/>
+        </w:rPr>
+      </w:pPr>
+      <w:r>
+        <w:rPr>
+          <w:lang w:val="es-MX"/>
+        </w:rPr>
+        <w:t>/</w:t>
+      </w:r>
+      <w:proofErr w:type="spellStart"/>
+      <w:r>
+        <w:rPr>
+          <w:lang w:val="es-MX"/>
+        </w:rPr>
+        <w:t>auth-service</w:t>
+      </w:r>
+      <w:proofErr w:type="spellEnd"/>
+      <w:r>
+        <w:rPr>
+          <w:lang w:val="es-MX"/>
+        </w:rPr>
+        <w:t xml:space="preserve">: </w:t>
+      </w:r>
+      <w:proofErr w:type="spellStart"/>
+      <w:r>
+        <w:rPr>
+          <w:lang w:val="es-MX"/>
+        </w:rPr>
+        <w:t>Microservicio</w:t>
+      </w:r>
+      <w:proofErr w:type="spellEnd"/>
+      <w:r>
+        <w:rPr>
+          <w:lang w:val="es-MX"/>
+        </w:rPr>
+        <w:t xml:space="preserve"> de seguridad (Node.js/Express).</w:t>
+      </w:r>
+    </w:p>
+    <w:p>
+      <w:pPr>
+        <w:numPr>
+          <w:ilvl w:val="1"/>
+          <w:numId w:val="5"/>
+        </w:numPr>
+        <w:rPr>
+          <w:lang w:val="es-MX"/>
+        </w:rPr>
+      </w:pPr>
+      <w:r>
+        <w:rPr>
+          <w:lang w:val="es-MX"/>
+        </w:rPr>
+        <w:t>/</w:t>
+      </w:r>
+      <w:proofErr w:type="spellStart"/>
+      <w:r>
+        <w:rPr>
+          <w:lang w:val="es-MX"/>
+        </w:rPr>
+        <w:t>ia-service</w:t>
+      </w:r>
+      <w:proofErr w:type="spellEnd"/>
+      <w:r>
+        <w:rPr>
+          <w:lang w:val="es-MX"/>
+        </w:rPr>
+        <w:t>: Procesamiento de voz y diagnóstico.</w:t>
+      </w:r>
+    </w:p>
+    <w:p>
+      <w:pPr>
+        <w:numPr>
+          <w:ilvl w:val="1"/>
+          <w:numId w:val="5"/>
+        </w:numPr>
+        <w:rPr>
+          <w:lang w:val="es-MX"/>
+        </w:rPr>
+      </w:pPr>
+      <w:r>
+        <w:rPr>
+          <w:lang w:val="es-MX"/>
+        </w:rPr>
+        <w:t>/</w:t>
+      </w:r>
+      <w:proofErr w:type="spellStart"/>
+      <w:r>
+        <w:rPr>
+          <w:lang w:val="es-MX"/>
+        </w:rPr>
+        <w:t>clinical-service</w:t>
+      </w:r>
+      <w:proofErr w:type="spellEnd"/>
+      <w:r>
+        <w:rPr>
+          <w:lang w:val="es-MX"/>
+        </w:rPr>
+        <w:t>: Gestión de historias clínicas.</w:t>
+      </w:r>
+    </w:p>
+    <w:p>
+      <w:pPr>
+        <w:numPr>
+          <w:ilvl w:val="1"/>
+          <w:numId w:val="5"/>
+        </w:numPr>
+      </w:pPr>
+      <w:r>
+        <w:t xml:space="preserve">/gateway: </w:t>
+      </w:r>
+      <w:proofErr w:type="spellStart"/>
+      <w:r>
+        <w:t>Configuración</w:t>
+      </w:r>
+      <w:proofErr w:type="spellEnd"/>
+      <w:r>
+        <w:t xml:space="preserve"> de Nginx.</w:t>
+      </w:r>
+    </w:p>
+    <w:p>
+      <w:pPr>
+        <w:numPr>
+          <w:ilvl w:val="1"/>
+          <w:numId w:val="5"/>
+        </w:numPr>
+      </w:pPr>
+      <w:r>
+        <w:t xml:space="preserve">/mobile-app: Proyecto </w:t>
+      </w:r>
+      <w:proofErr w:type="spellStart"/>
+      <w:r>
+        <w:t>en</w:t>
+      </w:r>
+      <w:proofErr w:type="spellEnd"/>
+      <w:r>
+        <w:t xml:space="preserve"> React Native.</w:t>
+      </w:r>
+    </w:p>
+    <w:p>
+      <w:pPr>
+        <w:numPr>
+          <w:ilvl w:val="1"/>
+          <w:numId w:val="5"/>
+        </w:numPr>
+        <w:rPr>
+          <w:lang w:val="es-MX"/>
+        </w:rPr>
+      </w:pPr>
+      <w:r>
+        <w:rPr>
+          <w:lang w:val="es-MX"/>
+        </w:rPr>
+        <w:t>/</w:t>
+      </w:r>
+      <w:proofErr w:type="spellStart"/>
+      <w:r>
+        <w:rPr>
+          <w:lang w:val="es-MX"/>
+        </w:rPr>
+        <w:t>docs</w:t>
+      </w:r>
+      <w:proofErr w:type="spellEnd"/>
+      <w:r>
+        <w:rPr>
+          <w:lang w:val="es-MX"/>
+        </w:rPr>
+        <w:t>: Diagramas UML/C4 y bitácoras de auditoría.</w:t>
+      </w:r>
+    </w:p>
+    <w:p>
+      <w:pPr>
+        <w:numPr>
+          <w:ilvl w:val="1"/>
+          <w:numId w:val="5"/>
+        </w:numPr>
+        <w:rPr>
+          <w:lang w:val="es-MX"/>
+        </w:rPr>
+      </w:pPr>
+      <w:proofErr w:type="spellStart"/>
+      <w:r>
+        <w:rPr>
+          <w:lang w:val="es-MX"/>
+        </w:rPr>
+        <w:t>docker-compose.yml</w:t>
+      </w:r>
+      <w:proofErr w:type="spellEnd"/>
+      <w:r>
+        <w:rPr>
+          <w:lang w:val="es-MX"/>
+        </w:rPr>
+        <w:t>: El archivo maestro de despliegue.</w:t>
+      </w:r>
+    </w:p>
+    <w:p>
+      <w:pPr>
+        <w:rPr>
+          <w:b/>
+          <w:bCs/>
+          <w:lang w:val="es-MX"/>
+        </w:rPr>
+      </w:pPr>
+      <w:r>
+        <w:rPr>
+          <w:b/>
+          <w:bCs/>
+          <w:lang w:val="es-MX"/>
+        </w:rPr>
+        <w:t xml:space="preserve">Fase 2: Desarrollo de </w:t>
+      </w:r>
+      <w:proofErr w:type="spellStart"/>
+      <w:r>
+        <w:rPr>
+          <w:b/>
+          <w:bCs/>
+          <w:lang w:val="es-MX"/>
+        </w:rPr>
+        <w:t>Microservicios</w:t>
+      </w:r>
+      <w:proofErr w:type="spellEnd"/>
+      <w:r>
+        <w:rPr>
+          <w:b/>
+          <w:bCs/>
+          <w:lang w:val="es-MX"/>
+        </w:rPr>
+        <w:t xml:space="preserve"> y Persistencia Políglota</w:t>
+      </w:r>
+    </w:p>
+    <w:p>
+      <w:pPr>
+        <w:rPr>
+          <w:lang w:val="es-MX"/>
+        </w:rPr>
+      </w:pPr>
+      <w:r>
+        <w:rPr>
+          <w:lang w:val="es-MX"/>
+        </w:rPr>
+        <w:t>Debes implementar una estrategia híbrida de bases de datos para cumplir con el estándar de ingeniería profesional.</w:t>
+      </w:r>
+    </w:p>
+    <w:p>
+      <w:pPr>
+        <w:numPr>
+          <w:ilvl w:val="0"/>
+          <w:numId w:val="6"/>
+        </w:numPr>
+        <w:rPr>
+          <w:lang w:val="es-MX"/>
+        </w:rPr>
+      </w:pPr>
+      <w:r>
+        <w:rPr>
+          <w:b/>
+          <w:bCs/>
+          <w:lang w:val="es-MX"/>
+        </w:rPr>
+        <w:lastRenderedPageBreak/>
+        <w:t>Servicio de Autenticación (</w:t>
+      </w:r>
+      <w:proofErr w:type="spellStart"/>
+      <w:r>
+        <w:rPr>
+          <w:b/>
+          <w:bCs/>
+          <w:lang w:val="es-MX"/>
+        </w:rPr>
+        <w:t>Auth</w:t>
+      </w:r>
+      <w:proofErr w:type="spellEnd"/>
+      <w:r>
+        <w:rPr>
+          <w:b/>
+          <w:bCs/>
+          <w:lang w:val="es-MX"/>
+        </w:rPr>
+        <w:t>):</w:t>
+      </w:r>
+      <w:r>
+        <w:rPr>
+          <w:lang w:val="es-MX"/>
+        </w:rPr>
+        <w:t xml:space="preserve"> Usa </w:t>
+      </w:r>
+      <w:proofErr w:type="spellStart"/>
+      <w:r>
+        <w:rPr>
+          <w:b/>
+          <w:bCs/>
+          <w:lang w:val="es-MX"/>
+        </w:rPr>
+        <w:t>PostgreSQL</w:t>
+      </w:r>
+      <w:proofErr w:type="spellEnd"/>
+      <w:r>
+        <w:rPr>
+          <w:lang w:val="es-MX"/>
+        </w:rPr>
+        <w:t xml:space="preserve"> para gestionar usuarios y roles, garantizando integridad referencial y seguridad mediante </w:t>
+      </w:r>
+      <w:proofErr w:type="spellStart"/>
+      <w:r>
+        <w:rPr>
+          <w:lang w:val="es-MX"/>
+        </w:rPr>
+        <w:t>tokens</w:t>
+      </w:r>
+      <w:proofErr w:type="spellEnd"/>
+      <w:r>
+        <w:rPr>
+          <w:lang w:val="es-MX"/>
+        </w:rPr>
+        <w:t xml:space="preserve"> JWT.</w:t>
+      </w:r>
+    </w:p>
+    <w:p>
+      <w:pPr>
+        <w:numPr>
+          <w:ilvl w:val="0"/>
+          <w:numId w:val="6"/>
+        </w:numPr>
+        <w:rPr>
+          <w:lang w:val="es-MX"/>
+        </w:rPr>
+      </w:pPr>
+      <w:r>
+        <w:rPr>
+          <w:b/>
+          <w:bCs/>
+          <w:lang w:val="es-MX"/>
+        </w:rPr>
+        <w:t>Servicio de Historias Clínicas:</w:t>
+      </w:r>
+      <w:r>
+        <w:rPr>
+          <w:lang w:val="es-MX"/>
+        </w:rPr>
+        <w:t xml:space="preserve"> Usa </w:t>
+      </w:r>
+      <w:proofErr w:type="spellStart"/>
+      <w:r>
+        <w:rPr>
+          <w:b/>
+          <w:bCs/>
+          <w:lang w:val="es-MX"/>
+        </w:rPr>
+        <w:t>MongoDB</w:t>
+      </w:r>
+      <w:proofErr w:type="spellEnd"/>
+      <w:r>
+        <w:rPr>
+          <w:lang w:val="es-MX"/>
+        </w:rPr>
+        <w:t xml:space="preserve"> para almacenar los datos no estructurados de las consultas médicas.</w:t>
+      </w:r>
+    </w:p>
+    <w:p>
+      <w:pPr>
+        <w:numPr>
+          <w:ilvl w:val="0"/>
+          <w:numId w:val="6"/>
+        </w:numPr>
+        <w:rPr>
+          <w:lang w:val="es-MX"/>
+        </w:rPr>
+      </w:pPr>
+      <w:r>
+        <w:rPr>
+          <w:b/>
+          <w:bCs/>
+          <w:lang w:val="es-MX"/>
+        </w:rPr>
+        <w:t>Capa de Caché:</w:t>
+      </w:r>
+      <w:r>
+        <w:rPr>
+          <w:lang w:val="es-MX"/>
+        </w:rPr>
+        <w:t xml:space="preserve"> Implementa </w:t>
+      </w:r>
+      <w:proofErr w:type="spellStart"/>
+      <w:r>
+        <w:rPr>
+          <w:b/>
+          <w:bCs/>
+          <w:lang w:val="es-MX"/>
+        </w:rPr>
+        <w:t>Redis</w:t>
+      </w:r>
+      <w:proofErr w:type="spellEnd"/>
+      <w:r>
+        <w:rPr>
+          <w:lang w:val="es-MX"/>
+        </w:rPr>
+        <w:t xml:space="preserve"> obligatoriamente para procesos asíncronos y para acelerar el acceso a datos frecuentes.</w:t>
+      </w:r>
+    </w:p>
+    <w:p>
+      <w:pPr>
+        <w:rPr>
+          <w:lang w:val="es-MX"/>
+        </w:rPr>
+      </w:pPr>
+      <w:r>
+        <w:rPr>
+          <w:b/>
+          <w:bCs/>
+          <w:lang w:val="es-MX"/>
+        </w:rPr>
+        <w:t>Auditoría de esta fase:</w:t>
+      </w:r>
+      <w:r>
+        <w:rPr>
+          <w:lang w:val="es-MX"/>
+        </w:rPr>
+        <w:t xml:space="preserve"> Debes documentar por qué elegiste cada base de datos (</w:t>
+      </w:r>
+      <w:proofErr w:type="spellStart"/>
+      <w:r>
+        <w:rPr>
+          <w:lang w:val="es-MX"/>
+        </w:rPr>
+        <w:t>PostgreSQL</w:t>
+      </w:r>
+      <w:proofErr w:type="spellEnd"/>
+      <w:r>
+        <w:rPr>
+          <w:lang w:val="es-MX"/>
+        </w:rPr>
+        <w:t xml:space="preserve"> para lo transaccional y </w:t>
+      </w:r>
+      <w:proofErr w:type="spellStart"/>
+      <w:r>
+        <w:rPr>
+          <w:lang w:val="es-MX"/>
+        </w:rPr>
+        <w:t>MongoDB</w:t>
+      </w:r>
+      <w:proofErr w:type="spellEnd"/>
+      <w:r>
+        <w:rPr>
+          <w:lang w:val="es-MX"/>
+        </w:rPr>
+        <w:t xml:space="preserve"> para lo flexible) en tu informe metodológico.</w:t>
+      </w:r>
+    </w:p>
+    <w:p>
+      <w:r>
+        <w:pict>
+          <v:rect id="_x0000_i1025" style="width:0;height:1.5pt" o:hralign="center" o:hrstd="t" o:hr="t" fillcolor="#a0a0a0" stroked="f"/>
+        </w:pict>
+      </w:r>
+    </w:p>
+    <w:p>
+      <w:pPr>
+        <w:rPr>
+          <w:b/>
+          <w:bCs/>
+          <w:lang w:val="es-MX"/>
+        </w:rPr>
+      </w:pPr>
+      <w:r>
+        <w:rPr>
+          <w:b/>
+          <w:bCs/>
+          <w:lang w:val="es-MX"/>
+        </w:rPr>
+        <w:t>Fase 3: Integración de la App Offline-</w:t>
+      </w:r>
+      <w:proofErr w:type="spellStart"/>
+      <w:r>
+        <w:rPr>
+          <w:b/>
+          <w:bCs/>
+          <w:lang w:val="es-MX"/>
+        </w:rPr>
+        <w:t>First</w:t>
+      </w:r>
+      <w:proofErr w:type="spellEnd"/>
+    </w:p>
+    <w:p>
+      <w:pPr>
+        <w:rPr>
+          <w:lang w:val="es-MX"/>
+        </w:rPr>
+      </w:pPr>
+      <w:r>
+        <w:rPr>
+          <w:lang w:val="es-MX"/>
+        </w:rPr>
+        <w:t>Esta es la capacidad más crítica para tu evaluación. La app debe funcionar sin conexión y sincronizarse al detectar red.</w:t>
+      </w:r>
+    </w:p>
+    <w:p>
+      <w:pPr>
+        <w:numPr>
+          <w:ilvl w:val="0"/>
+          <w:numId w:val="7"/>
+        </w:numPr>
+        <w:rPr>
+          <w:lang w:val="es-MX"/>
+        </w:rPr>
+      </w:pPr>
+      <w:r>
+        <w:rPr>
+          <w:b/>
+          <w:bCs/>
+          <w:lang w:val="es-MX"/>
+        </w:rPr>
+        <w:t>Persistencia Local:</w:t>
+      </w:r>
+      <w:r>
+        <w:rPr>
+          <w:lang w:val="es-MX"/>
+        </w:rPr>
+        <w:t xml:space="preserve"> Configura </w:t>
+      </w:r>
+      <w:proofErr w:type="spellStart"/>
+      <w:r>
+        <w:rPr>
+          <w:b/>
+          <w:bCs/>
+          <w:lang w:val="es-MX"/>
+        </w:rPr>
+        <w:t>SQLite</w:t>
+      </w:r>
+      <w:proofErr w:type="spellEnd"/>
+      <w:r>
+        <w:rPr>
+          <w:lang w:val="es-MX"/>
+        </w:rPr>
+        <w:t xml:space="preserve"> (o </w:t>
+      </w:r>
+      <w:proofErr w:type="spellStart"/>
+      <w:r>
+        <w:rPr>
+          <w:lang w:val="es-MX"/>
+        </w:rPr>
+        <w:t>WatermelonDB</w:t>
+      </w:r>
+      <w:proofErr w:type="spellEnd"/>
+      <w:r>
+        <w:rPr>
+          <w:lang w:val="es-MX"/>
+        </w:rPr>
+        <w:t>) dentro de la carpeta /</w:t>
+      </w:r>
+      <w:proofErr w:type="spellStart"/>
+      <w:r>
+        <w:rPr>
+          <w:lang w:val="es-MX"/>
+        </w:rPr>
+        <w:t>mobile</w:t>
+      </w:r>
+      <w:proofErr w:type="spellEnd"/>
+      <w:r>
+        <w:rPr>
+          <w:lang w:val="es-MX"/>
+        </w:rPr>
+        <w:t>-app para guardar los datos localmente.</w:t>
+      </w:r>
+    </w:p>
+    <w:p>
+      <w:pPr>
+        <w:numPr>
+          <w:ilvl w:val="0"/>
+          <w:numId w:val="7"/>
+        </w:numPr>
+        <w:rPr>
+          <w:lang w:val="es-MX"/>
+        </w:rPr>
+      </w:pPr>
+      <w:proofErr w:type="spellStart"/>
+      <w:r>
+        <w:rPr>
+          <w:b/>
+          <w:bCs/>
+          <w:lang w:val="es-MX"/>
+        </w:rPr>
+        <w:t>Sync</w:t>
+      </w:r>
+      <w:proofErr w:type="spellEnd"/>
+      <w:r>
+        <w:rPr>
+          <w:b/>
+          <w:bCs/>
+          <w:lang w:val="es-MX"/>
+        </w:rPr>
+        <w:t xml:space="preserve"> </w:t>
+      </w:r>
+      <w:proofErr w:type="spellStart"/>
+      <w:r>
+        <w:rPr>
+          <w:b/>
+          <w:bCs/>
+          <w:lang w:val="es-MX"/>
+        </w:rPr>
+        <w:t>Engine</w:t>
+      </w:r>
+      <w:proofErr w:type="spellEnd"/>
+      <w:r>
+        <w:rPr>
+          <w:b/>
+          <w:bCs/>
+          <w:lang w:val="es-MX"/>
+        </w:rPr>
+        <w:t xml:space="preserve"> (Motor de Sincronización):</w:t>
+      </w:r>
+      <w:r>
+        <w:rPr>
+          <w:lang w:val="es-MX"/>
+        </w:rPr>
+        <w:t xml:space="preserve"> Implementa la lógica que compare los datos locales con los del servidor.</w:t>
+      </w:r>
+    </w:p>
+    <w:p>
+      <w:pPr>
+        <w:numPr>
+          <w:ilvl w:val="0"/>
+          <w:numId w:val="7"/>
+        </w:numPr>
+        <w:rPr>
+          <w:lang w:val="es-MX"/>
+        </w:rPr>
+      </w:pPr>
+      <w:r>
+        <w:rPr>
+          <w:b/>
+          <w:bCs/>
+          <w:lang w:val="es-MX"/>
+        </w:rPr>
+        <w:t>Resolución de Conflictos:</w:t>
+      </w:r>
+      <w:r>
+        <w:rPr>
+          <w:lang w:val="es-MX"/>
+        </w:rPr>
+        <w:t xml:space="preserve"> Debes aplicar una estrategia como </w:t>
+      </w:r>
+      <w:r>
+        <w:rPr>
+          <w:b/>
+          <w:bCs/>
+          <w:lang w:val="es-MX"/>
+        </w:rPr>
+        <w:t>"</w:t>
+      </w:r>
+      <w:proofErr w:type="spellStart"/>
+      <w:r>
+        <w:rPr>
+          <w:b/>
+          <w:bCs/>
+          <w:lang w:val="es-MX"/>
+        </w:rPr>
+        <w:t>Last</w:t>
+      </w:r>
+      <w:proofErr w:type="spellEnd"/>
+      <w:r>
+        <w:rPr>
+          <w:b/>
+          <w:bCs/>
+          <w:lang w:val="es-MX"/>
+        </w:rPr>
+        <w:t xml:space="preserve"> </w:t>
+      </w:r>
+      <w:proofErr w:type="spellStart"/>
+      <w:r>
+        <w:rPr>
+          <w:b/>
+          <w:bCs/>
+          <w:lang w:val="es-MX"/>
+        </w:rPr>
+        <w:t>Write</w:t>
+      </w:r>
+      <w:proofErr w:type="spellEnd"/>
+      <w:r>
+        <w:rPr>
+          <w:b/>
+          <w:bCs/>
+          <w:lang w:val="es-MX"/>
+        </w:rPr>
+        <w:t xml:space="preserve"> </w:t>
+      </w:r>
+      <w:proofErr w:type="spellStart"/>
+      <w:r>
+        <w:rPr>
+          <w:b/>
+          <w:bCs/>
+          <w:lang w:val="es-MX"/>
+        </w:rPr>
+        <w:t>Wins</w:t>
+      </w:r>
+      <w:proofErr w:type="spellEnd"/>
+      <w:r>
+        <w:rPr>
+          <w:b/>
+          <w:bCs/>
+          <w:lang w:val="es-MX"/>
+        </w:rPr>
+        <w:t>"</w:t>
+      </w:r>
+      <w:r>
+        <w:rPr>
+          <w:lang w:val="es-MX"/>
+        </w:rPr>
+        <w:t xml:space="preserve"> (el último que escribe gana) para decidir qué dato es válido tras una reconexión.</w:t>
+      </w:r>
+    </w:p>
+    <w:p>
+      <w:r>
+        <w:pict>
+          <v:rect id="_x0000_i1026" style="width:0;height:1.5pt" o:hralign="center" o:hrstd="t" o:hr="t" fillcolor="#a0a0a0" stroked="f"/>
+        </w:pict>
+      </w:r>
+    </w:p>
+    <w:p>
+      <w:pPr>
+        <w:rPr>
+          <w:b/>
+          <w:bCs/>
+          <w:lang w:val="es-MX"/>
+        </w:rPr>
+      </w:pPr>
+      <w:r>
+        <w:rPr>
+          <w:b/>
+          <w:bCs/>
+          <w:lang w:val="es-MX"/>
+        </w:rPr>
+        <w:t>Fase 4: Documentación y Auditoría Continua</w:t>
+      </w:r>
+    </w:p>
+    <w:p>
+      <w:pPr>
+        <w:rPr>
+          <w:lang w:val="es-MX"/>
+        </w:rPr>
+      </w:pPr>
+      <w:r>
+        <w:rPr>
+          <w:lang w:val="es-MX"/>
+        </w:rPr>
+        <w:t>Para evitar problemas en la defensa, cada decisión técnica debe estar respaldada por evidencia.</w:t>
+      </w:r>
+    </w:p>
+    <w:p>
+      <w:pPr>
+        <w:numPr>
+          <w:ilvl w:val="0"/>
+          <w:numId w:val="8"/>
+        </w:numPr>
+        <w:rPr>
+          <w:lang w:val="es-MX"/>
+        </w:rPr>
+      </w:pPr>
+      <w:r>
+        <w:rPr>
+          <w:b/>
+          <w:bCs/>
+          <w:lang w:val="es-MX"/>
+        </w:rPr>
+        <w:t>Diagramas Obligatorios:</w:t>
+      </w:r>
+      <w:r>
+        <w:rPr>
+          <w:lang w:val="es-MX"/>
+        </w:rPr>
+        <w:t xml:space="preserve"> Necesitas crear los diagramas de Casos de Uso, Despliegue, Componentes y el Diagrama Entidad-Relación (DER).</w:t>
+      </w:r>
+    </w:p>
+    <w:p>
+      <w:pPr>
+        <w:numPr>
+          <w:ilvl w:val="0"/>
+          <w:numId w:val="8"/>
+        </w:numPr>
+      </w:pPr>
+      <w:r>
+        <w:rPr>
+          <w:b/>
+          <w:bCs/>
+          <w:lang w:val="es-MX"/>
+        </w:rPr>
+        <w:t>Bitácora de Auditoría:</w:t>
+      </w:r>
+      <w:r>
+        <w:rPr>
+          <w:lang w:val="es-MX"/>
+        </w:rPr>
+        <w:t xml:space="preserve"> Crea un archivo llamado AUDITORIA.md en la raíz. </w:t>
+      </w:r>
+      <w:proofErr w:type="spellStart"/>
+      <w:r>
+        <w:t>Cada</w:t>
+      </w:r>
+      <w:proofErr w:type="spellEnd"/>
+      <w:r>
+        <w:t xml:space="preserve"> </w:t>
+      </w:r>
+      <w:proofErr w:type="spellStart"/>
+      <w:r>
+        <w:t>día</w:t>
+      </w:r>
+      <w:proofErr w:type="spellEnd"/>
+      <w:r>
+        <w:t xml:space="preserve">, </w:t>
+      </w:r>
+      <w:proofErr w:type="spellStart"/>
+      <w:r>
+        <w:t>anota</w:t>
+      </w:r>
+      <w:proofErr w:type="spellEnd"/>
+      <w:r>
+        <w:t>:</w:t>
+      </w:r>
+    </w:p>
+    <w:p>
+      <w:pPr>
+        <w:numPr>
+          <w:ilvl w:val="1"/>
+          <w:numId w:val="8"/>
+        </w:numPr>
+      </w:pPr>
+      <w:proofErr w:type="spellStart"/>
+      <w:r>
+        <w:t>Qué</w:t>
+      </w:r>
+      <w:proofErr w:type="spellEnd"/>
+      <w:r>
+        <w:t xml:space="preserve"> </w:t>
+      </w:r>
+      <w:proofErr w:type="spellStart"/>
+      <w:r>
+        <w:t>componente</w:t>
+      </w:r>
+      <w:proofErr w:type="spellEnd"/>
+      <w:r>
+        <w:t xml:space="preserve"> </w:t>
+      </w:r>
+      <w:proofErr w:type="spellStart"/>
+      <w:r>
+        <w:t>desarrollaste</w:t>
+      </w:r>
+      <w:proofErr w:type="spellEnd"/>
+      <w:r>
+        <w:t>.</w:t>
+      </w:r>
+    </w:p>
+    <w:p>
+      <w:pPr>
+        <w:numPr>
+          <w:ilvl w:val="1"/>
+          <w:numId w:val="8"/>
+        </w:numPr>
+      </w:pPr>
+      <w:proofErr w:type="spellStart"/>
+      <w:r>
+        <w:t>Qué</w:t>
+      </w:r>
+      <w:proofErr w:type="spellEnd"/>
+      <w:r>
+        <w:t xml:space="preserve"> </w:t>
+      </w:r>
+      <w:proofErr w:type="spellStart"/>
+      <w:r>
+        <w:t>problema</w:t>
+      </w:r>
+      <w:proofErr w:type="spellEnd"/>
+      <w:r>
+        <w:t xml:space="preserve"> </w:t>
+      </w:r>
+      <w:proofErr w:type="spellStart"/>
+      <w:r>
+        <w:t>técnico</w:t>
+      </w:r>
+      <w:proofErr w:type="spellEnd"/>
+      <w:r>
+        <w:t xml:space="preserve"> </w:t>
+      </w:r>
+      <w:proofErr w:type="spellStart"/>
+      <w:r>
+        <w:t>resolviste</w:t>
+      </w:r>
+      <w:proofErr w:type="spellEnd"/>
+      <w:r>
+        <w:t>.</w:t>
+      </w:r>
+    </w:p>
+    <w:p>
+      <w:pPr>
+        <w:numPr>
+          <w:ilvl w:val="1"/>
+          <w:numId w:val="8"/>
+        </w:numPr>
+        <w:rPr>
+          <w:lang w:val="es-MX"/>
+        </w:rPr>
+      </w:pPr>
+      <w:r>
+        <w:rPr>
+          <w:lang w:val="es-MX"/>
+        </w:rPr>
+        <w:t xml:space="preserve">Cómo aplicaste los estándares de seguridad (como evitar el </w:t>
+      </w:r>
+      <w:proofErr w:type="spellStart"/>
+      <w:r>
+        <w:rPr>
+          <w:i/>
+          <w:iCs/>
+          <w:lang w:val="es-MX"/>
+        </w:rPr>
+        <w:t>hardcoding</w:t>
+      </w:r>
+      <w:proofErr w:type="spellEnd"/>
+      <w:r>
+        <w:rPr>
+          <w:lang w:val="es-MX"/>
+        </w:rPr>
+        <w:t xml:space="preserve"> de secretos).</w:t>
+      </w:r>
+    </w:p>
+    <w:p>
+      <w:pPr>
+        <w:numPr>
+          <w:ilvl w:val="0"/>
+          <w:numId w:val="8"/>
+        </w:numPr>
+        <w:rPr>
+          <w:lang w:val="es-MX"/>
+        </w:rPr>
+      </w:pPr>
+      <w:r>
+        <w:rPr>
+          <w:b/>
+          <w:bCs/>
+          <w:lang w:val="es-MX"/>
+        </w:rPr>
+        <w:t>Pruebas de Carga:</w:t>
+      </w:r>
+      <w:r>
+        <w:rPr>
+          <w:lang w:val="es-MX"/>
+        </w:rPr>
+        <w:t xml:space="preserve"> Deberás usar herramientas como </w:t>
+      </w:r>
+      <w:proofErr w:type="spellStart"/>
+      <w:r>
+        <w:rPr>
+          <w:lang w:val="es-MX"/>
+        </w:rPr>
+        <w:t>JMeter</w:t>
+      </w:r>
+      <w:proofErr w:type="spellEnd"/>
+      <w:r>
+        <w:rPr>
+          <w:lang w:val="es-MX"/>
+        </w:rPr>
+        <w:t xml:space="preserve"> para demostrar que tu sistema soporta más de 500 peticiones concurrentes.</w:t>
+      </w:r>
+    </w:p>
+    <w:p>
+      <w:pPr>
+        <w:rPr>
+          <w:lang w:val="es-MX"/>
+        </w:rPr>
+      </w:pPr>
+    </w:p>
+    <w:p>
       <w:bookmarkStart w:id="0" w:name="_GoBack"/>
+      <w:r>
+        <w:t>docker exec -it &lt;athenea-postgres&gt; psql -U athenea -d authdb</w:t>
+      </w:r>
       <w:bookmarkEnd w:id="0"/>
     </w:p>
     <w:sectPr>
@@ -1237,6 +3209,236 @@
     </w:lvl>
   </w:abstractNum>
   <w:abstractNum w:abstractNumId="2" w15:restartNumberingAfterBreak="0">
+    <w:nsid w:val="3C485804"/>
+    <w:multiLevelType w:val="multilevel"/>
+    <w:tmpl w:val="D7D6E8CE"/>
+    <w:lvl w:ilvl="0">
+      <w:start w:val="1"/>
+      <w:numFmt w:val="decimal"/>
+      <w:lvlText w:val="%1."/>
+      <w:lvlJc w:val="left"/>
+      <w:pPr>
+        <w:tabs>
+          <w:tab w:val="num" w:pos="720"/>
+        </w:tabs>
+        <w:ind w:left="720" w:hanging="360"/>
+      </w:pPr>
+    </w:lvl>
+    <w:lvl w:ilvl="1" w:tentative="1">
+      <w:start w:val="1"/>
+      <w:numFmt w:val="decimal"/>
+      <w:lvlText w:val="%2."/>
+      <w:lvlJc w:val="left"/>
+      <w:pPr>
+        <w:tabs>
+          <w:tab w:val="num" w:pos="1440"/>
+        </w:tabs>
+        <w:ind w:left="1440" w:hanging="360"/>
+      </w:pPr>
+    </w:lvl>
+    <w:lvl w:ilvl="2" w:tentative="1">
+      <w:start w:val="1"/>
+      <w:numFmt w:val="decimal"/>
+      <w:lvlText w:val="%3."/>
+      <w:lvlJc w:val="left"/>
+      <w:pPr>
+        <w:tabs>
+          <w:tab w:val="num" w:pos="2160"/>
+        </w:tabs>
+        <w:ind w:left="2160" w:hanging="360"/>
+      </w:pPr>
+    </w:lvl>
+    <w:lvl w:ilvl="3" w:tentative="1">
+      <w:start w:val="1"/>
+      <w:numFmt w:val="decimal"/>
+      <w:lvlText w:val="%4."/>
+      <w:lvlJc w:val="left"/>
+      <w:pPr>
+        <w:tabs>
+          <w:tab w:val="num" w:pos="2880"/>
+        </w:tabs>
+        <w:ind w:left="2880" w:hanging="360"/>
+      </w:pPr>
+    </w:lvl>
+    <w:lvl w:ilvl="4" w:tentative="1">
+      <w:start w:val="1"/>
+      <w:numFmt w:val="decimal"/>
+      <w:lvlText w:val="%5."/>
+      <w:lvlJc w:val="left"/>
+      <w:pPr>
+        <w:tabs>
+          <w:tab w:val="num" w:pos="3600"/>
+        </w:tabs>
+        <w:ind w:left="3600" w:hanging="360"/>
+      </w:pPr>
+    </w:lvl>
+    <w:lvl w:ilvl="5" w:tentative="1">
+      <w:start w:val="1"/>
+      <w:numFmt w:val="decimal"/>
+      <w:lvlText w:val="%6."/>
+      <w:lvlJc w:val="left"/>
+      <w:pPr>
+        <w:tabs>
+          <w:tab w:val="num" w:pos="4320"/>
+        </w:tabs>
+        <w:ind w:left="4320" w:hanging="360"/>
+      </w:pPr>
+    </w:lvl>
+    <w:lvl w:ilvl="6" w:tentative="1">
+      <w:start w:val="1"/>
+      <w:numFmt w:val="decimal"/>
+      <w:lvlText w:val="%7."/>
+      <w:lvlJc w:val="left"/>
+      <w:pPr>
+        <w:tabs>
+          <w:tab w:val="num" w:pos="5040"/>
+        </w:tabs>
+        <w:ind w:left="5040" w:hanging="360"/>
+      </w:pPr>
+    </w:lvl>
+    <w:lvl w:ilvl="7" w:tentative="1">
+      <w:start w:val="1"/>
+      <w:numFmt w:val="decimal"/>
+      <w:lvlText w:val="%8."/>
+      <w:lvlJc w:val="left"/>
+      <w:pPr>
+        <w:tabs>
+          <w:tab w:val="num" w:pos="5760"/>
+        </w:tabs>
+        <w:ind w:left="5760" w:hanging="360"/>
+      </w:pPr>
+    </w:lvl>
+    <w:lvl w:ilvl="8" w:tentative="1">
+      <w:start w:val="1"/>
+      <w:numFmt w:val="decimal"/>
+      <w:lvlText w:val="%9."/>
+      <w:lvlJc w:val="left"/>
+      <w:pPr>
+        <w:tabs>
+          <w:tab w:val="num" w:pos="6480"/>
+        </w:tabs>
+        <w:ind w:left="6480" w:hanging="360"/>
+      </w:pPr>
+    </w:lvl>
+  </w:abstractNum>
+  <w:abstractNum w:abstractNumId="3" w15:restartNumberingAfterBreak="0">
+    <w:nsid w:val="45911797"/>
+    <w:multiLevelType w:val="multilevel"/>
+    <w:tmpl w:val="4358DBFC"/>
+    <w:lvl w:ilvl="0">
+      <w:start w:val="1"/>
+      <w:numFmt w:val="decimal"/>
+      <w:lvlText w:val="%1."/>
+      <w:lvlJc w:val="left"/>
+      <w:pPr>
+        <w:tabs>
+          <w:tab w:val="num" w:pos="720"/>
+        </w:tabs>
+        <w:ind w:left="720" w:hanging="360"/>
+      </w:pPr>
+    </w:lvl>
+    <w:lvl w:ilvl="1">
+      <w:start w:val="1"/>
+      <w:numFmt w:val="bullet"/>
+      <w:lvlText w:val="o"/>
+      <w:lvlJc w:val="left"/>
+      <w:pPr>
+        <w:tabs>
+          <w:tab w:val="num" w:pos="1440"/>
+        </w:tabs>
+        <w:ind w:left="1440" w:hanging="360"/>
+      </w:pPr>
+      <w:rPr>
+        <w:rFonts w:ascii="Courier New" w:hAnsi="Courier New" w:hint="default"/>
+        <w:sz w:val="20"/>
+      </w:rPr>
+    </w:lvl>
+    <w:lvl w:ilvl="2" w:tentative="1">
+      <w:start w:val="1"/>
+      <w:numFmt w:val="decimal"/>
+      <w:lvlText w:val="%3."/>
+      <w:lvlJc w:val="left"/>
+      <w:pPr>
+        <w:tabs>
+          <w:tab w:val="num" w:pos="2160"/>
+        </w:tabs>
+        <w:ind w:left="2160" w:hanging="360"/>
+      </w:pPr>
+    </w:lvl>
+    <w:lvl w:ilvl="3" w:tentative="1">
+      <w:start w:val="1"/>
+      <w:numFmt w:val="decimal"/>
+      <w:lvlText w:val="%4."/>
+      <w:lvlJc w:val="left"/>
+      <w:pPr>
+        <w:tabs>
+          <w:tab w:val="num" w:pos="2880"/>
+        </w:tabs>
+        <w:ind w:left="2880" w:hanging="360"/>
+      </w:pPr>
+    </w:lvl>
+    <w:lvl w:ilvl="4" w:tentative="1">
+      <w:start w:val="1"/>
+      <w:numFmt w:val="decimal"/>
+      <w:lvlText w:val="%5."/>
+      <w:lvlJc w:val="left"/>
+      <w:pPr>
+        <w:tabs>
+          <w:tab w:val="num" w:pos="3600"/>
+        </w:tabs>
+        <w:ind w:left="3600" w:hanging="360"/>
+      </w:pPr>
+    </w:lvl>
+    <w:lvl w:ilvl="5" w:tentative="1">
+      <w:start w:val="1"/>
+      <w:numFmt w:val="decimal"/>
+      <w:lvlText w:val="%6."/>
+      <w:lvlJc w:val="left"/>
+      <w:pPr>
+        <w:tabs>
+          <w:tab w:val="num" w:pos="4320"/>
+        </w:tabs>
+        <w:ind w:left="4320" w:hanging="360"/>
+      </w:pPr>
+    </w:lvl>
+    <w:lvl w:ilvl="6" w:tentative="1">
+      <w:start w:val="1"/>
+      <w:numFmt w:val="decimal"/>
+      <w:lvlText w:val="%7."/>
+      <w:lvlJc w:val="left"/>
+      <w:pPr>
+        <w:tabs>
+          <w:tab w:val="num" w:pos="5040"/>
+        </w:tabs>
+        <w:ind w:left="5040" w:hanging="360"/>
+      </w:pPr>
+    </w:lvl>
+    <w:lvl w:ilvl="7" w:tentative="1">
+      <w:start w:val="1"/>
+      <w:numFmt w:val="decimal"/>
+      <w:lvlText w:val="%8."/>
+      <w:lvlJc w:val="left"/>
+      <w:pPr>
+        <w:tabs>
+          <w:tab w:val="num" w:pos="5760"/>
+        </w:tabs>
+        <w:ind w:left="5760" w:hanging="360"/>
+      </w:pPr>
+    </w:lvl>
+    <w:lvl w:ilvl="8" w:tentative="1">
+      <w:start w:val="1"/>
+      <w:numFmt w:val="decimal"/>
+      <w:lvlText w:val="%9."/>
+      <w:lvlJc w:val="left"/>
+      <w:pPr>
+        <w:tabs>
+          <w:tab w:val="num" w:pos="6480"/>
+        </w:tabs>
+        <w:ind w:left="6480" w:hanging="360"/>
+      </w:pPr>
+    </w:lvl>
+  </w:abstractNum>
+  <w:abstractNum w:abstractNumId="4" w15:restartNumberingAfterBreak="0">
     <w:nsid w:val="509709D3"/>
     <w:multiLevelType w:val="multilevel"/>
     <w:tmpl w:val="4DBEDC32"/>
@@ -1385,7 +3587,156 @@
       </w:rPr>
     </w:lvl>
   </w:abstractNum>
-  <w:abstractNum w:abstractNumId="3" w15:restartNumberingAfterBreak="0">
+  <w:abstractNum w:abstractNumId="5" w15:restartNumberingAfterBreak="0">
+    <w:nsid w:val="5B342CE5"/>
+    <w:multiLevelType w:val="multilevel"/>
+    <w:tmpl w:val="1D00D11A"/>
+    <w:lvl w:ilvl="0">
+      <w:start w:val="1"/>
+      <w:numFmt w:val="bullet"/>
+      <w:lvlText w:val=""/>
+      <w:lvlJc w:val="left"/>
+      <w:pPr>
+        <w:tabs>
+          <w:tab w:val="num" w:pos="720"/>
+        </w:tabs>
+        <w:ind w:left="720" w:hanging="360"/>
+      </w:pPr>
+      <w:rPr>
+        <w:rFonts w:ascii="Symbol" w:hAnsi="Symbol" w:hint="default"/>
+        <w:sz w:val="20"/>
+      </w:rPr>
+    </w:lvl>
+    <w:lvl w:ilvl="1">
+      <w:start w:val="1"/>
+      <w:numFmt w:val="bullet"/>
+      <w:lvlText w:val="o"/>
+      <w:lvlJc w:val="left"/>
+      <w:pPr>
+        <w:tabs>
+          <w:tab w:val="num" w:pos="1440"/>
+        </w:tabs>
+        <w:ind w:left="1440" w:hanging="360"/>
+      </w:pPr>
+      <w:rPr>
+        <w:rFonts w:ascii="Courier New" w:hAnsi="Courier New" w:hint="default"/>
+        <w:sz w:val="20"/>
+      </w:rPr>
+    </w:lvl>
+    <w:lvl w:ilvl="2" w:tentative="1">
+      <w:start w:val="1"/>
+      <w:numFmt w:val="bullet"/>
+      <w:lvlText w:val=""/>
+      <w:lvlJc w:val="left"/>
+      <w:pPr>
+        <w:tabs>
+          <w:tab w:val="num" w:pos="2160"/>
+        </w:tabs>
+        <w:ind w:left="2160" w:hanging="360"/>
+      </w:pPr>
+      <w:rPr>
+        <w:rFonts w:ascii="Wingdings" w:hAnsi="Wingdings" w:hint="default"/>
+        <w:sz w:val="20"/>
+      </w:rPr>
+    </w:lvl>
+    <w:lvl w:ilvl="3" w:tentative="1">
+      <w:start w:val="1"/>
+      <w:numFmt w:val="bullet"/>
+      <w:lvlText w:val=""/>
+      <w:lvlJc w:val="left"/>
+      <w:pPr>
+        <w:tabs>
+          <w:tab w:val="num" w:pos="2880"/>
+        </w:tabs>
+        <w:ind w:left="2880" w:hanging="360"/>
+      </w:pPr>
+      <w:rPr>
+        <w:rFonts w:ascii="Wingdings" w:hAnsi="Wingdings" w:hint="default"/>
+        <w:sz w:val="20"/>
+      </w:rPr>
+    </w:lvl>
+    <w:lvl w:ilvl="4" w:tentative="1">
+      <w:start w:val="1"/>
+      <w:numFmt w:val="bullet"/>
+      <w:lvlText w:val=""/>
+      <w:lvlJc w:val="left"/>
+      <w:pPr>
+        <w:tabs>
+          <w:tab w:val="num" w:pos="3600"/>
+        </w:tabs>
+        <w:ind w:left="3600" w:hanging="360"/>
+      </w:pPr>
+      <w:rPr>
+        <w:rFonts w:ascii="Wingdings" w:hAnsi="Wingdings" w:hint="default"/>
+        <w:sz w:val="20"/>
+      </w:rPr>
+    </w:lvl>
+    <w:lvl w:ilvl="5" w:tentative="1">
+      <w:start w:val="1"/>
+      <w:numFmt w:val="bullet"/>
+      <w:lvlText w:val=""/>
+      <w:lvlJc w:val="left"/>
+      <w:pPr>
+        <w:tabs>
+          <w:tab w:val="num" w:pos="4320"/>
+        </w:tabs>
+        <w:ind w:left="4320" w:hanging="360"/>
+      </w:pPr>
+      <w:rPr>
+        <w:rFonts w:ascii="Wingdings" w:hAnsi="Wingdings" w:hint="default"/>
+        <w:sz w:val="20"/>
+      </w:rPr>
+    </w:lvl>
+    <w:lvl w:ilvl="6" w:tentative="1">
+      <w:start w:val="1"/>
+      <w:numFmt w:val="bullet"/>
+      <w:lvlText w:val=""/>
+      <w:lvlJc w:val="left"/>
+      <w:pPr>
+        <w:tabs>
+          <w:tab w:val="num" w:pos="5040"/>
+        </w:tabs>
+        <w:ind w:left="5040" w:hanging="360"/>
+      </w:pPr>
+      <w:rPr>
+        <w:rFonts w:ascii="Wingdings" w:hAnsi="Wingdings" w:hint="default"/>
+        <w:sz w:val="20"/>
+      </w:rPr>
+    </w:lvl>
+    <w:lvl w:ilvl="7" w:tentative="1">
+      <w:start w:val="1"/>
+      <w:numFmt w:val="bullet"/>
+      <w:lvlText w:val=""/>
+      <w:lvlJc w:val="left"/>
+      <w:pPr>
+        <w:tabs>
+          <w:tab w:val="num" w:pos="5760"/>
+        </w:tabs>
+        <w:ind w:left="5760" w:hanging="360"/>
+      </w:pPr>
+      <w:rPr>
+        <w:rFonts w:ascii="Wingdings" w:hAnsi="Wingdings" w:hint="default"/>
+        <w:sz w:val="20"/>
+      </w:rPr>
+    </w:lvl>
+    <w:lvl w:ilvl="8" w:tentative="1">
+      <w:start w:val="1"/>
+      <w:numFmt w:val="bullet"/>
+      <w:lvlText w:val=""/>
+      <w:lvlJc w:val="left"/>
+      <w:pPr>
+        <w:tabs>
+          <w:tab w:val="num" w:pos="6480"/>
+        </w:tabs>
+        <w:ind w:left="6480" w:hanging="360"/>
+      </w:pPr>
+      <w:rPr>
+        <w:rFonts w:ascii="Wingdings" w:hAnsi="Wingdings" w:hint="default"/>
+        <w:sz w:val="20"/>
+      </w:rPr>
+    </w:lvl>
+  </w:abstractNum>
+  <w:abstractNum w:abstractNumId="6" w15:restartNumberingAfterBreak="0">
     <w:nsid w:val="74CC1942"/>
     <w:multiLevelType w:val="multilevel"/>
     <w:tmpl w:val="648CD606"/>
@@ -1534,17 +3885,178 @@
       </w:rPr>
     </w:lvl>
   </w:abstractNum>
+  <w:abstractNum w:abstractNumId="7" w15:restartNumberingAfterBreak="0">
+    <w:nsid w:val="7BE97B98"/>
+    <w:multiLevelType w:val="multilevel"/>
+    <w:tmpl w:val="9FFC078A"/>
+    <w:lvl w:ilvl="0">
+      <w:start w:val="1"/>
+      <w:numFmt w:val="bullet"/>
+      <w:lvlText w:val=""/>
+      <w:lvlJc w:val="left"/>
+      <w:pPr>
+        <w:tabs>
+          <w:tab w:val="num" w:pos="720"/>
+        </w:tabs>
+        <w:ind w:left="720" w:hanging="360"/>
+      </w:pPr>
+      <w:rPr>
+        <w:rFonts w:ascii="Symbol" w:hAnsi="Symbol" w:hint="default"/>
+        <w:sz w:val="20"/>
+      </w:rPr>
+    </w:lvl>
+    <w:lvl w:ilvl="1" w:tentative="1">
+      <w:start w:val="1"/>
+      <w:numFmt w:val="bullet"/>
+      <w:lvlText w:val="o"/>
+      <w:lvlJc w:val="left"/>
+      <w:pPr>
+        <w:tabs>
+          <w:tab w:val="num" w:pos="1440"/>
+        </w:tabs>
+        <w:ind w:left="1440" w:hanging="360"/>
+      </w:pPr>
+      <w:rPr>
+        <w:rFonts w:ascii="Courier New" w:hAnsi="Courier New" w:hint="default"/>
+        <w:sz w:val="20"/>
+      </w:rPr>
+    </w:lvl>
+    <w:lvl w:ilvl="2" w:tentative="1">
+      <w:start w:val="1"/>
+      <w:numFmt w:val="bullet"/>
+      <w:lvlText w:val=""/>
+      <w:lvlJc w:val="left"/>
+      <w:pPr>
+        <w:tabs>
+          <w:tab w:val="num" w:pos="2160"/>
+        </w:tabs>
+        <w:ind w:left="2160" w:hanging="360"/>
+      </w:pPr>
+      <w:rPr>
+        <w:rFonts w:ascii="Wingdings" w:hAnsi="Wingdings" w:hint="default"/>
+        <w:sz w:val="20"/>
+      </w:rPr>
+    </w:lvl>
+    <w:lvl w:ilvl="3" w:tentative="1">
+      <w:start w:val="1"/>
+      <w:numFmt w:val="bullet"/>
+      <w:lvlText w:val=""/>
+      <w:lvlJc w:val="left"/>
+      <w:pPr>
+        <w:tabs>
+          <w:tab w:val="num" w:pos="2880"/>
+        </w:tabs>
+        <w:ind w:left="2880" w:hanging="360"/>
+      </w:pPr>
+      <w:rPr>
+        <w:rFonts w:ascii="Wingdings" w:hAnsi="Wingdings" w:hint="default"/>
+        <w:sz w:val="20"/>
+      </w:rPr>
+    </w:lvl>
+    <w:lvl w:ilvl="4" w:tentative="1">
+      <w:start w:val="1"/>
+      <w:numFmt w:val="bullet"/>
+      <w:lvlText w:val=""/>
+      <w:lvlJc w:val="left"/>
+      <w:pPr>
+        <w:tabs>
+          <w:tab w:val="num" w:pos="3600"/>
+        </w:tabs>
+        <w:ind w:left="3600" w:hanging="360"/>
+      </w:pPr>
+      <w:rPr>
+        <w:rFonts w:ascii="Wingdings" w:hAnsi="Wingdings" w:hint="default"/>
+        <w:sz w:val="20"/>
+      </w:rPr>
+    </w:lvl>
+    <w:lvl w:ilvl="5" w:tentative="1">
+      <w:start w:val="1"/>
+      <w:numFmt w:val="bullet"/>
+      <w:lvlText w:val=""/>
+      <w:lvlJc w:val="left"/>
+      <w:pPr>
+        <w:tabs>
+          <w:tab w:val="num" w:pos="4320"/>
+        </w:tabs>
+        <w:ind w:left="4320" w:hanging="360"/>
+      </w:pPr>
+      <w:rPr>
+        <w:rFonts w:ascii="Wingdings" w:hAnsi="Wingdings" w:hint="default"/>
+        <w:sz w:val="20"/>
+      </w:rPr>
+    </w:lvl>
+    <w:lvl w:ilvl="6" w:tentative="1">
+      <w:start w:val="1"/>
+      <w:numFmt w:val="bullet"/>
+      <w:lvlText w:val=""/>
+      <w:lvlJc w:val="left"/>
+      <w:pPr>
+        <w:tabs>
+          <w:tab w:val="num" w:pos="5040"/>
+        </w:tabs>
+        <w:ind w:left="5040" w:hanging="360"/>
+      </w:pPr>
+      <w:rPr>
+        <w:rFonts w:ascii="Wingdings" w:hAnsi="Wingdings" w:hint="default"/>
+        <w:sz w:val="20"/>
+      </w:rPr>
+    </w:lvl>
+    <w:lvl w:ilvl="7" w:tentative="1">
+      <w:start w:val="1"/>
+      <w:numFmt w:val="bullet"/>
+      <w:lvlText w:val=""/>
+      <w:lvlJc w:val="left"/>
+      <w:pPr>
+        <w:tabs>
+          <w:tab w:val="num" w:pos="5760"/>
+        </w:tabs>
+        <w:ind w:left="5760" w:hanging="360"/>
+      </w:pPr>
+      <w:rPr>
+        <w:rFonts w:ascii="Wingdings" w:hAnsi="Wingdings" w:hint="default"/>
+        <w:sz w:val="20"/>
+      </w:rPr>
+    </w:lvl>
+    <w:lvl w:ilvl="8" w:tentative="1">
+      <w:start w:val="1"/>
+      <w:numFmt w:val="bullet"/>
+      <w:lvlText w:val=""/>
+      <w:lvlJc w:val="left"/>
+      <w:pPr>
+        <w:tabs>
+          <w:tab w:val="num" w:pos="6480"/>
+        </w:tabs>
+        <w:ind w:left="6480" w:hanging="360"/>
+      </w:pPr>
+      <w:rPr>
+        <w:rFonts w:ascii="Wingdings" w:hAnsi="Wingdings" w:hint="default"/>
+        <w:sz w:val="20"/>
+      </w:rPr>
+    </w:lvl>
+  </w:abstractNum>
   <w:num w:numId="1">
-    <w:abstractNumId w:val="2"/>
+    <w:abstractNumId w:val="4"/>
   </w:num>
   <w:num w:numId="2">
     <w:abstractNumId w:val="0"/>
   </w:num>
   <w:num w:numId="3">
-    <w:abstractNumId w:val="3"/>
+    <w:abstractNumId w:val="6"/>
   </w:num>
   <w:num w:numId="4">
     <w:abstractNumId w:val="1"/>
+  </w:num>
+  <w:num w:numId="5">
+    <w:abstractNumId w:val="3"/>
+  </w:num>
+  <w:num w:numId="6">
+    <w:abstractNumId w:val="7"/>
+  </w:num>
+  <w:num w:numId="7">
+    <w:abstractNumId w:val="2"/>
+  </w:num>
+  <w:num w:numId="8">
+    <w:abstractNumId w:val="5"/>
   </w:num>
 </w:numbering>
 </file>
@@ -2029,6 +4541,43 @@
     <w:basedOn w:val="Fuentedeprrafopredeter"/>
     <w:rsid w:val="00D61706"/>
   </w:style>
+  <w:style w:type="paragraph" w:customStyle="1" w:styleId="font-claude-response-body">
+    <w:name w:val="font-claude-response-body"/>
+    <w:basedOn w:val="Normal"/>
+    <w:rsid w:val="003A0448"/>
+    <w:pPr>
+      <w:spacing w:before="100" w:beforeAutospacing="1" w:after="100" w:afterAutospacing="1" w:line="240" w:lineRule="auto"/>
+    </w:pPr>
+    <w:rPr>
+      <w:rFonts w:ascii="Times New Roman" w:eastAsia="Times New Roman" w:hAnsi="Times New Roman" w:cs="Times New Roman"/>
+      <w:sz w:val="24"/>
+      <w:szCs w:val="24"/>
+    </w:rPr>
+  </w:style>
+  <w:style w:type="character" w:styleId="CdigoHTML">
+    <w:name w:val="HTML Code"/>
+    <w:basedOn w:val="Fuentedeprrafopredeter"/>
+    <w:uiPriority w:val="99"/>
+    <w:semiHidden/>
+    <w:unhideWhenUsed/>
+    <w:rsid w:val="003A0448"/>
+    <w:rPr>
+      <w:rFonts w:ascii="Courier New" w:eastAsia="Times New Roman" w:hAnsi="Courier New" w:cs="Courier New"/>
+      <w:sz w:val="20"/>
+      <w:szCs w:val="20"/>
+    </w:rPr>
+  </w:style>
+  <w:style w:type="character" w:styleId="Textoennegrita">
+    <w:name w:val="Strong"/>
+    <w:basedOn w:val="Fuentedeprrafopredeter"/>
+    <w:uiPriority w:val="22"/>
+    <w:qFormat/>
+    <w:rsid w:val="003A0448"/>
+    <w:rPr>
+      <w:b/>
+      <w:bCs/>
+    </w:rPr>
+  </w:style>
 </w:styles>
 </file>
 

</xml_diff>

<commit_message>
nginx, gateway y containers de docker con mongo y postgres funcionando
</commit_message>
<xml_diff>
--- a/Explicacion_Microservicios.docx
+++ b/Explicacion_Microservicios.docx
@@ -1754,22 +1754,1107 @@
     </w:p>
     <w:p>
       <w:pPr>
-        <w:rPr>
-          <w:lang w:val="es-MX"/>
-        </w:rPr>
-      </w:pPr>
-    </w:p>
-    <w:p>
-      <w:pPr>
-        <w:rPr>
-          <w:lang w:val="es-MX"/>
-        </w:rPr>
-      </w:pPr>
-      <w:r>
-        <w:rPr>
-          <w:lang w:val="es-MX"/>
-        </w:rPr>
-        <w:t xml:space="preserve">Necesito hacer una APP que contenga una IA que funcione offline que sirva para recibir historias clínicas de un consultorio optometrista, cuando tenga conexión deberá sincronizar con una base de datos que ya tengo configurada en Mongo Atlas. Me vas a explicar paso por paso porque es para mi tesis y necesito saber TODO y auditar todo. Me ayudas a fabricar el código y me explicas línea por línea dándome maneras creativas de realizar para que yo pueda aprender y asimismo aprobar. Necesito también subir este proyecto cada progreso que haga al </w:t>
+        <w:pStyle w:val="font-claude-response-body"/>
+        <w:rPr>
+          <w:lang w:val="es-MX"/>
+        </w:rPr>
+      </w:pPr>
+    </w:p>
+    <w:p>
+      <w:pPr>
+        <w:pStyle w:val="font-claude-response-body"/>
+        <w:rPr>
+          <w:lang w:val="es-MX"/>
+        </w:rPr>
+      </w:pPr>
+      <w:r>
+        <w:rPr>
+          <w:lang w:val="es-MX"/>
+        </w:rPr>
+        <w:t>## Día 1 — [fecha]</w:t>
+      </w:r>
+    </w:p>
+    <w:p>
+      <w:pPr>
+        <w:pStyle w:val="font-claude-response-body"/>
+        <w:rPr>
+          <w:lang w:val="es-MX"/>
+        </w:rPr>
+      </w:pPr>
+      <w:r>
+        <w:rPr>
+          <w:lang w:val="es-MX"/>
+        </w:rPr>
+        <w:t>### Componente desarrollado</w:t>
+      </w:r>
+    </w:p>
+    <w:p>
+      <w:pPr>
+        <w:pStyle w:val="font-claude-response-body"/>
+        <w:rPr>
+          <w:lang w:val="es-MX"/>
+        </w:rPr>
+      </w:pPr>
+      <w:proofErr w:type="spellStart"/>
+      <w:r>
+        <w:rPr>
+          <w:lang w:val="es-MX"/>
+        </w:rPr>
+        <w:t>Docker</w:t>
+      </w:r>
+      <w:proofErr w:type="spellEnd"/>
+      <w:r>
+        <w:rPr>
+          <w:lang w:val="es-MX"/>
+        </w:rPr>
+        <w:t xml:space="preserve"> </w:t>
+      </w:r>
+      <w:proofErr w:type="spellStart"/>
+      <w:r>
+        <w:rPr>
+          <w:lang w:val="es-MX"/>
+        </w:rPr>
+        <w:t>Compose</w:t>
+      </w:r>
+      <w:proofErr w:type="spellEnd"/>
+      <w:r>
+        <w:rPr>
+          <w:lang w:val="es-MX"/>
+        </w:rPr>
+        <w:t xml:space="preserve"> completo con 7 contenedores: </w:t>
+      </w:r>
+      <w:proofErr w:type="spellStart"/>
+      <w:r>
+        <w:rPr>
+          <w:lang w:val="es-MX"/>
+        </w:rPr>
+        <w:t>PostgreSQL</w:t>
+      </w:r>
+      <w:proofErr w:type="spellEnd"/>
+      <w:r>
+        <w:rPr>
+          <w:lang w:val="es-MX"/>
+        </w:rPr>
+        <w:t xml:space="preserve">, </w:t>
+      </w:r>
+      <w:proofErr w:type="spellStart"/>
+      <w:r>
+        <w:rPr>
+          <w:lang w:val="es-MX"/>
+        </w:rPr>
+        <w:t>MongoDB</w:t>
+      </w:r>
+      <w:proofErr w:type="spellEnd"/>
+      <w:r>
+        <w:rPr>
+          <w:lang w:val="es-MX"/>
+        </w:rPr>
+        <w:t xml:space="preserve">, </w:t>
+      </w:r>
+      <w:proofErr w:type="spellStart"/>
+      <w:r>
+        <w:rPr>
+          <w:lang w:val="es-MX"/>
+        </w:rPr>
+        <w:t>Redis</w:t>
+      </w:r>
+      <w:proofErr w:type="spellEnd"/>
+      <w:r>
+        <w:rPr>
+          <w:lang w:val="es-MX"/>
+        </w:rPr>
+        <w:t>,</w:t>
+      </w:r>
+    </w:p>
+    <w:p>
+      <w:pPr>
+        <w:pStyle w:val="font-claude-response-body"/>
+      </w:pPr>
+      <w:proofErr w:type="spellStart"/>
+      <w:r>
+        <w:t>auth</w:t>
+      </w:r>
+      <w:proofErr w:type="spellEnd"/>
+      <w:r>
+        <w:t xml:space="preserve">-service, clinical-service, </w:t>
+      </w:r>
+      <w:proofErr w:type="spellStart"/>
+      <w:r>
+        <w:t>ia</w:t>
+      </w:r>
+      <w:proofErr w:type="spellEnd"/>
+      <w:r>
+        <w:t>-service y Nginx gateway.</w:t>
+      </w:r>
+    </w:p>
+    <w:p>
+      <w:pPr>
+        <w:pStyle w:val="font-claude-response-body"/>
+      </w:pPr>
+    </w:p>
+    <w:p>
+      <w:pPr>
+        <w:pStyle w:val="font-claude-response-body"/>
+        <w:rPr>
+          <w:lang w:val="es-MX"/>
+        </w:rPr>
+      </w:pPr>
+      <w:r>
+        <w:rPr>
+          <w:lang w:val="es-MX"/>
+        </w:rPr>
+        <w:t>### Problema técnico resuelto</w:t>
+      </w:r>
+    </w:p>
+    <w:p>
+      <w:pPr>
+        <w:pStyle w:val="font-claude-response-body"/>
+        <w:rPr>
+          <w:lang w:val="es-MX"/>
+        </w:rPr>
+      </w:pPr>
+      <w:proofErr w:type="spellStart"/>
+      <w:r>
+        <w:rPr>
+          <w:lang w:val="es-MX"/>
+        </w:rPr>
+        <w:t>Race</w:t>
+      </w:r>
+      <w:proofErr w:type="spellEnd"/>
+      <w:r>
+        <w:rPr>
+          <w:lang w:val="es-MX"/>
+        </w:rPr>
+        <w:t xml:space="preserve"> </w:t>
+      </w:r>
+      <w:proofErr w:type="spellStart"/>
+      <w:r>
+        <w:rPr>
+          <w:lang w:val="es-MX"/>
+        </w:rPr>
+        <w:t>condition</w:t>
+      </w:r>
+      <w:proofErr w:type="spellEnd"/>
+      <w:r>
+        <w:rPr>
+          <w:lang w:val="es-MX"/>
+        </w:rPr>
+        <w:t xml:space="preserve"> entre </w:t>
+      </w:r>
+      <w:proofErr w:type="spellStart"/>
+      <w:r>
+        <w:rPr>
+          <w:lang w:val="es-MX"/>
+        </w:rPr>
+        <w:t>auth-service</w:t>
+      </w:r>
+      <w:proofErr w:type="spellEnd"/>
+      <w:r>
+        <w:rPr>
+          <w:lang w:val="es-MX"/>
+        </w:rPr>
+        <w:t xml:space="preserve"> y </w:t>
+      </w:r>
+      <w:proofErr w:type="spellStart"/>
+      <w:r>
+        <w:rPr>
+          <w:lang w:val="es-MX"/>
+        </w:rPr>
+        <w:t>PostgreSQL</w:t>
+      </w:r>
+      <w:proofErr w:type="spellEnd"/>
+      <w:r>
+        <w:rPr>
+          <w:lang w:val="es-MX"/>
+        </w:rPr>
+        <w:t xml:space="preserve">: el servicio arrancaba </w:t>
+      </w:r>
+    </w:p>
+    <w:p>
+      <w:pPr>
+        <w:pStyle w:val="font-claude-response-body"/>
+        <w:rPr>
+          <w:lang w:val="es-MX"/>
+        </w:rPr>
+      </w:pPr>
+      <w:r>
+        <w:rPr>
+          <w:lang w:val="es-MX"/>
+        </w:rPr>
+        <w:t xml:space="preserve">antes que la base de datos. </w:t>
+      </w:r>
+      <w:proofErr w:type="spellStart"/>
+      <w:r>
+        <w:rPr>
+          <w:lang w:val="es-MX"/>
+        </w:rPr>
+        <w:t>Docker</w:t>
+      </w:r>
+      <w:proofErr w:type="spellEnd"/>
+      <w:r>
+        <w:rPr>
+          <w:lang w:val="es-MX"/>
+        </w:rPr>
+        <w:t xml:space="preserve"> resolvió reiniciando el contenedor </w:t>
+      </w:r>
+    </w:p>
+    <w:p>
+      <w:pPr>
+        <w:pStyle w:val="font-claude-response-body"/>
+        <w:rPr>
+          <w:lang w:val="es-MX"/>
+        </w:rPr>
+      </w:pPr>
+      <w:r>
+        <w:rPr>
+          <w:lang w:val="es-MX"/>
+        </w:rPr>
+        <w:t xml:space="preserve">automáticamente hasta que </w:t>
+      </w:r>
+      <w:proofErr w:type="spellStart"/>
+      <w:r>
+        <w:rPr>
+          <w:lang w:val="es-MX"/>
+        </w:rPr>
+        <w:t>PostgreSQL</w:t>
+      </w:r>
+      <w:proofErr w:type="spellEnd"/>
+      <w:r>
+        <w:rPr>
+          <w:lang w:val="es-MX"/>
+        </w:rPr>
+        <w:t xml:space="preserve"> estuvo disponible.</w:t>
+      </w:r>
+    </w:p>
+    <w:p>
+      <w:pPr>
+        <w:pStyle w:val="font-claude-response-body"/>
+        <w:rPr>
+          <w:lang w:val="es-MX"/>
+        </w:rPr>
+      </w:pPr>
+    </w:p>
+    <w:p>
+      <w:pPr>
+        <w:pStyle w:val="font-claude-response-body"/>
+        <w:rPr>
+          <w:lang w:val="es-MX"/>
+        </w:rPr>
+      </w:pPr>
+      <w:r>
+        <w:rPr>
+          <w:lang w:val="es-MX"/>
+        </w:rPr>
+        <w:t>### Estándar de seguridad aplicado</w:t>
+      </w:r>
+    </w:p>
+    <w:p>
+      <w:pPr>
+        <w:pStyle w:val="font-claude-response-body"/>
+        <w:rPr>
+          <w:lang w:val="es-MX"/>
+        </w:rPr>
+      </w:pPr>
+      <w:r>
+        <w:rPr>
+          <w:lang w:val="es-MX"/>
+        </w:rPr>
+        <w:t xml:space="preserve">Variables de entorno gestionadas </w:t>
+      </w:r>
+      <w:proofErr w:type="gramStart"/>
+      <w:r>
+        <w:rPr>
+          <w:lang w:val="es-MX"/>
+        </w:rPr>
+        <w:t>con .</w:t>
+      </w:r>
+      <w:proofErr w:type="spellStart"/>
+      <w:r>
+        <w:rPr>
+          <w:lang w:val="es-MX"/>
+        </w:rPr>
+        <w:t>env</w:t>
+      </w:r>
+      <w:proofErr w:type="spellEnd"/>
+      <w:proofErr w:type="gramEnd"/>
+      <w:r>
+        <w:rPr>
+          <w:lang w:val="es-MX"/>
+        </w:rPr>
+        <w:t xml:space="preserve"> excluido del repositorio.</w:t>
+      </w:r>
+    </w:p>
+    <w:p>
+      <w:pPr>
+        <w:pStyle w:val="font-claude-response-body"/>
+        <w:rPr>
+          <w:lang w:val="es-MX"/>
+        </w:rPr>
+      </w:pPr>
+      <w:r>
+        <w:rPr>
+          <w:lang w:val="es-MX"/>
+        </w:rPr>
+        <w:t xml:space="preserve">Ninguna contraseña </w:t>
+      </w:r>
+      <w:proofErr w:type="spellStart"/>
+      <w:r>
+        <w:rPr>
+          <w:lang w:val="es-MX"/>
+        </w:rPr>
+        <w:t>hardcodeada</w:t>
+      </w:r>
+      <w:proofErr w:type="spellEnd"/>
+      <w:r>
+        <w:rPr>
+          <w:lang w:val="es-MX"/>
+        </w:rPr>
+        <w:t xml:space="preserve"> en el código fuente.</w:t>
+      </w:r>
+    </w:p>
+    <w:p>
+      <w:pPr>
+        <w:pStyle w:val="font-claude-response-body"/>
+        <w:rPr>
+          <w:lang w:val="es-MX"/>
+        </w:rPr>
+      </w:pPr>
+    </w:p>
+    <w:p>
+      <w:pPr>
+        <w:pStyle w:val="Ttulo3"/>
+        <w:rPr>
+          <w:lang w:val="es-MX"/>
+        </w:rPr>
+      </w:pPr>
+      <w:r>
+        <w:rPr>
+          <w:lang w:val="es-MX"/>
+        </w:rPr>
+        <w:lastRenderedPageBreak/>
+        <w:t xml:space="preserve">Lo que está excelente </w:t>
+      </w:r>
+      <w:r>
+        <w:rPr>
+          <w:rFonts w:ascii="Segoe UI Symbol" w:hAnsi="Segoe UI Symbol" w:cs="Segoe UI Symbol"/>
+          <w:lang w:val="es-MX"/>
+        </w:rPr>
+        <w:t>✅</w:t>
+      </w:r>
+    </w:p>
+    <w:p>
+      <w:pPr>
+        <w:pStyle w:val="font-claude-response-body"/>
+        <w:rPr>
+          <w:lang w:val="es-MX"/>
+        </w:rPr>
+      </w:pPr>
+      <w:proofErr w:type="spellStart"/>
+      <w:proofErr w:type="gramStart"/>
+      <w:r>
+        <w:rPr>
+          <w:rStyle w:val="CdigoHTML"/>
+          <w:b/>
+          <w:bCs/>
+          <w:lang w:val="es-MX"/>
+        </w:rPr>
+        <w:t>assertEnv</w:t>
+      </w:r>
+      <w:proofErr w:type="spellEnd"/>
+      <w:r>
+        <w:rPr>
+          <w:rStyle w:val="CdigoHTML"/>
+          <w:b/>
+          <w:bCs/>
+          <w:lang w:val="es-MX"/>
+        </w:rPr>
+        <w:t>(</w:t>
+      </w:r>
+      <w:proofErr w:type="gramEnd"/>
+      <w:r>
+        <w:rPr>
+          <w:rStyle w:val="CdigoHTML"/>
+          <w:b/>
+          <w:bCs/>
+          <w:lang w:val="es-MX"/>
+        </w:rPr>
+        <w:t>)</w:t>
+      </w:r>
+      <w:r>
+        <w:rPr>
+          <w:lang w:val="es-MX"/>
+        </w:rPr>
+        <w:t xml:space="preserve"> — antes de arrancar el servidor, verifica que las variables críticas existen. Si falta </w:t>
+      </w:r>
+      <w:r>
+        <w:rPr>
+          <w:rStyle w:val="CdigoHTML"/>
+          <w:lang w:val="es-MX"/>
+        </w:rPr>
+        <w:t>DATABASE_URL</w:t>
+      </w:r>
+      <w:r>
+        <w:rPr>
+          <w:lang w:val="es-MX"/>
+        </w:rPr>
+        <w:t xml:space="preserve"> o </w:t>
+      </w:r>
+      <w:r>
+        <w:rPr>
+          <w:rStyle w:val="CdigoHTML"/>
+          <w:lang w:val="es-MX"/>
+        </w:rPr>
+        <w:t>JWT_SECRET</w:t>
+      </w:r>
+      <w:r>
+        <w:rPr>
+          <w:lang w:val="es-MX"/>
+        </w:rPr>
+        <w:t xml:space="preserve">, el proceso muere con un mensaje claro en lugar de fallar misteriosamente después. Eso se llama </w:t>
+      </w:r>
+      <w:proofErr w:type="spellStart"/>
+      <w:r>
+        <w:rPr>
+          <w:rStyle w:val="Textoennegrita"/>
+          <w:lang w:val="es-MX"/>
+        </w:rPr>
+        <w:t>fail-fast</w:t>
+      </w:r>
+      <w:proofErr w:type="spellEnd"/>
+      <w:r>
+        <w:rPr>
+          <w:lang w:val="es-MX"/>
+        </w:rPr>
+        <w:t xml:space="preserve"> y es un patrón profesional.</w:t>
+      </w:r>
+    </w:p>
+    <w:p>
+      <w:pPr>
+        <w:pStyle w:val="font-claude-response-body"/>
+        <w:rPr>
+          <w:lang w:val="es-MX"/>
+        </w:rPr>
+      </w:pPr>
+      <w:proofErr w:type="spellStart"/>
+      <w:proofErr w:type="gramStart"/>
+      <w:r>
+        <w:rPr>
+          <w:rStyle w:val="CdigoHTML"/>
+          <w:b/>
+          <w:bCs/>
+          <w:lang w:val="es-MX"/>
+        </w:rPr>
+        <w:t>bcrypt.hash</w:t>
+      </w:r>
+      <w:proofErr w:type="spellEnd"/>
+      <w:proofErr w:type="gramEnd"/>
+      <w:r>
+        <w:rPr>
+          <w:rStyle w:val="CdigoHTML"/>
+          <w:b/>
+          <w:bCs/>
+          <w:lang w:val="es-MX"/>
+        </w:rPr>
+        <w:t>(</w:t>
+      </w:r>
+      <w:proofErr w:type="spellStart"/>
+      <w:r>
+        <w:rPr>
+          <w:rStyle w:val="CdigoHTML"/>
+          <w:b/>
+          <w:bCs/>
+          <w:lang w:val="es-MX"/>
+        </w:rPr>
+        <w:t>password</w:t>
+      </w:r>
+      <w:proofErr w:type="spellEnd"/>
+      <w:r>
+        <w:rPr>
+          <w:rStyle w:val="CdigoHTML"/>
+          <w:b/>
+          <w:bCs/>
+          <w:lang w:val="es-MX"/>
+        </w:rPr>
+        <w:t>, 12)</w:t>
+      </w:r>
+      <w:r>
+        <w:rPr>
+          <w:lang w:val="es-MX"/>
+        </w:rPr>
+        <w:t xml:space="preserve"> — el número </w:t>
+      </w:r>
+      <w:r>
+        <w:rPr>
+          <w:rStyle w:val="CdigoHTML"/>
+          <w:lang w:val="es-MX"/>
+        </w:rPr>
+        <w:t>12</w:t>
+      </w:r>
+      <w:r>
+        <w:rPr>
+          <w:lang w:val="es-MX"/>
+        </w:rPr>
+        <w:t xml:space="preserve"> es el "</w:t>
+      </w:r>
+      <w:proofErr w:type="spellStart"/>
+      <w:r>
+        <w:rPr>
+          <w:lang w:val="es-MX"/>
+        </w:rPr>
+        <w:t>salt</w:t>
+      </w:r>
+      <w:proofErr w:type="spellEnd"/>
+      <w:r>
+        <w:rPr>
+          <w:lang w:val="es-MX"/>
+        </w:rPr>
+        <w:t xml:space="preserve"> rounds", cuántas veces se procesa el hash. A mayor número, más </w:t>
+      </w:r>
+      <w:proofErr w:type="gramStart"/>
+      <w:r>
+        <w:rPr>
+          <w:lang w:val="es-MX"/>
+        </w:rPr>
+        <w:t>seguro</w:t>
+      </w:r>
+      <w:proofErr w:type="gramEnd"/>
+      <w:r>
+        <w:rPr>
+          <w:lang w:val="es-MX"/>
+        </w:rPr>
+        <w:t xml:space="preserve"> pero más lento. 12 es el estándar de la industria para 2024. Nunca guardas la contraseña real.</w:t>
+      </w:r>
+    </w:p>
+    <w:p>
+      <w:pPr>
+        <w:pStyle w:val="font-claude-response-body"/>
+        <w:rPr>
+          <w:lang w:val="es-MX"/>
+        </w:rPr>
+      </w:pPr>
+      <w:proofErr w:type="spellStart"/>
+      <w:proofErr w:type="gramStart"/>
+      <w:r>
+        <w:rPr>
+          <w:rStyle w:val="CdigoHTML"/>
+          <w:b/>
+          <w:bCs/>
+          <w:lang w:val="es-MX"/>
+        </w:rPr>
+        <w:t>email.toLowerCase</w:t>
+      </w:r>
+      <w:proofErr w:type="spellEnd"/>
+      <w:proofErr w:type="gramEnd"/>
+      <w:r>
+        <w:rPr>
+          <w:rStyle w:val="CdigoHTML"/>
+          <w:b/>
+          <w:bCs/>
+          <w:lang w:val="es-MX"/>
+        </w:rPr>
+        <w:t>()</w:t>
+      </w:r>
+      <w:r>
+        <w:rPr>
+          <w:lang w:val="es-MX"/>
+        </w:rPr>
+        <w:t xml:space="preserve"> — normaliza el email antes de guardarlo. Evita que </w:t>
+      </w:r>
+      <w:r>
+        <w:rPr>
+          <w:rStyle w:val="CdigoHTML"/>
+          <w:lang w:val="es-MX"/>
+        </w:rPr>
+        <w:t>Usuario@gmail.com</w:t>
+      </w:r>
+      <w:r>
+        <w:rPr>
+          <w:lang w:val="es-MX"/>
+        </w:rPr>
+        <w:t xml:space="preserve"> y </w:t>
+      </w:r>
+      <w:r>
+        <w:rPr>
+          <w:rStyle w:val="CdigoHTML"/>
+          <w:lang w:val="es-MX"/>
+        </w:rPr>
+        <w:t>usuario@gmail.com</w:t>
+      </w:r>
+      <w:r>
+        <w:rPr>
+          <w:lang w:val="es-MX"/>
+        </w:rPr>
+        <w:t xml:space="preserve"> sean tratados como cuentas distintas.</w:t>
+      </w:r>
+    </w:p>
+    <w:p>
+      <w:pPr>
+        <w:pStyle w:val="font-claude-response-body"/>
+        <w:rPr>
+          <w:lang w:val="es-MX"/>
+        </w:rPr>
+      </w:pPr>
+      <w:proofErr w:type="spellStart"/>
+      <w:proofErr w:type="gramStart"/>
+      <w:r>
+        <w:rPr>
+          <w:rStyle w:val="CdigoHTML"/>
+          <w:b/>
+          <w:bCs/>
+          <w:lang w:val="es-MX"/>
+        </w:rPr>
+        <w:t>e.code</w:t>
+      </w:r>
+      <w:proofErr w:type="spellEnd"/>
+      <w:proofErr w:type="gramEnd"/>
+      <w:r>
+        <w:rPr>
+          <w:rStyle w:val="CdigoHTML"/>
+          <w:b/>
+          <w:bCs/>
+          <w:lang w:val="es-MX"/>
+        </w:rPr>
+        <w:t xml:space="preserve"> === "23505"</w:t>
+      </w:r>
+      <w:r>
+        <w:rPr>
+          <w:lang w:val="es-MX"/>
+        </w:rPr>
+        <w:t xml:space="preserve"> — ese es el código de error de </w:t>
+      </w:r>
+      <w:proofErr w:type="spellStart"/>
+      <w:r>
+        <w:rPr>
+          <w:lang w:val="es-MX"/>
+        </w:rPr>
+        <w:t>PostgreSQL</w:t>
+      </w:r>
+      <w:proofErr w:type="spellEnd"/>
+      <w:r>
+        <w:rPr>
+          <w:lang w:val="es-MX"/>
+        </w:rPr>
+        <w:t xml:space="preserve"> para violación de unicidad. En lugar de dejar caer el servidor, lo capturas y devuelves un 409 limpio. Excelente manejo de errores.</w:t>
+      </w:r>
+    </w:p>
+    <w:p>
+      <w:pPr>
+        <w:pStyle w:val="font-claude-response-body"/>
+        <w:rPr>
+          <w:lang w:val="es-MX"/>
+        </w:rPr>
+      </w:pPr>
+      <w:proofErr w:type="spellStart"/>
+      <w:r>
+        <w:rPr>
+          <w:rStyle w:val="Textoennegrita"/>
+          <w:lang w:val="es-MX"/>
+        </w:rPr>
+        <w:t>Redis</w:t>
+      </w:r>
+      <w:proofErr w:type="spellEnd"/>
+      <w:r>
+        <w:rPr>
+          <w:rStyle w:val="Textoennegrita"/>
+          <w:lang w:val="es-MX"/>
+        </w:rPr>
+        <w:t xml:space="preserve"> con </w:t>
+      </w:r>
+      <w:proofErr w:type="spellStart"/>
+      <w:r>
+        <w:rPr>
+          <w:rStyle w:val="CdigoHTML"/>
+          <w:b/>
+          <w:bCs/>
+          <w:lang w:val="es-MX"/>
+        </w:rPr>
+        <w:t>setEx</w:t>
+      </w:r>
+      <w:proofErr w:type="spellEnd"/>
+      <w:r>
+        <w:rPr>
+          <w:lang w:val="es-MX"/>
+        </w:rPr>
+        <w:t xml:space="preserve"> — guarda la sesión con expiración de 8 horas, igual que el JWT. Eso permite hacer </w:t>
+      </w:r>
+      <w:proofErr w:type="spellStart"/>
+      <w:r>
+        <w:rPr>
+          <w:lang w:val="es-MX"/>
+        </w:rPr>
+        <w:t>logout</w:t>
+      </w:r>
+      <w:proofErr w:type="spellEnd"/>
+      <w:r>
+        <w:rPr>
+          <w:lang w:val="es-MX"/>
+        </w:rPr>
+        <w:t xml:space="preserve"> real invalidando la sesión en </w:t>
+      </w:r>
+      <w:proofErr w:type="spellStart"/>
+      <w:r>
+        <w:rPr>
+          <w:lang w:val="es-MX"/>
+        </w:rPr>
+        <w:t>Redis</w:t>
+      </w:r>
+      <w:proofErr w:type="spellEnd"/>
+      <w:r>
+        <w:rPr>
+          <w:lang w:val="es-MX"/>
+        </w:rPr>
+        <w:t xml:space="preserve"> sin esperar a que expire el </w:t>
+      </w:r>
+      <w:proofErr w:type="spellStart"/>
+      <w:r>
+        <w:rPr>
+          <w:lang w:val="es-MX"/>
+        </w:rPr>
+        <w:t>token</w:t>
+      </w:r>
+      <w:proofErr w:type="spellEnd"/>
+      <w:r>
+        <w:rPr>
+          <w:lang w:val="es-MX"/>
+        </w:rPr>
+        <w:t>.</w:t>
+      </w:r>
+    </w:p>
+    <w:p>
+      <w:pPr>
+        <w:pStyle w:val="font-claude-response-body"/>
+        <w:rPr>
+          <w:lang w:val="es-MX"/>
+        </w:rPr>
+      </w:pPr>
+      <w:r>
+        <w:rPr>
+          <w:rStyle w:val="CdigoHTML"/>
+          <w:b/>
+          <w:bCs/>
+          <w:lang w:val="es-MX"/>
+        </w:rPr>
+        <w:t>"0.0.0.0"</w:t>
+      </w:r>
+      <w:r>
+        <w:rPr>
+          <w:lang w:val="es-MX"/>
+        </w:rPr>
+        <w:t xml:space="preserve"> en </w:t>
+      </w:r>
+      <w:proofErr w:type="spellStart"/>
+      <w:proofErr w:type="gramStart"/>
+      <w:r>
+        <w:rPr>
+          <w:rStyle w:val="CdigoHTML"/>
+          <w:lang w:val="es-MX"/>
+        </w:rPr>
+        <w:t>app.listen</w:t>
+      </w:r>
+      <w:proofErr w:type="spellEnd"/>
+      <w:proofErr w:type="gramEnd"/>
+      <w:r>
+        <w:rPr>
+          <w:lang w:val="es-MX"/>
+        </w:rPr>
+        <w:t xml:space="preserve"> — escucha en todas las interfaces de red del contenedor, necesario para que </w:t>
+      </w:r>
+      <w:proofErr w:type="spellStart"/>
+      <w:r>
+        <w:rPr>
+          <w:lang w:val="es-MX"/>
+        </w:rPr>
+        <w:t>Docker</w:t>
+      </w:r>
+      <w:proofErr w:type="spellEnd"/>
+      <w:r>
+        <w:rPr>
+          <w:lang w:val="es-MX"/>
+        </w:rPr>
+        <w:t xml:space="preserve"> pueda </w:t>
+      </w:r>
+      <w:proofErr w:type="spellStart"/>
+      <w:r>
+        <w:rPr>
+          <w:lang w:val="es-MX"/>
+        </w:rPr>
+        <w:t>enrutar</w:t>
+      </w:r>
+      <w:proofErr w:type="spellEnd"/>
+      <w:r>
+        <w:rPr>
+          <w:lang w:val="es-MX"/>
+        </w:rPr>
+        <w:t xml:space="preserve"> tráfico hacia él.</w:t>
+      </w:r>
+    </w:p>
+    <w:p>
+      <w:pPr>
+        <w:pStyle w:val="Ttulo3"/>
+        <w:rPr>
+          <w:lang w:val="es-MX"/>
+        </w:rPr>
+      </w:pPr>
+      <w:proofErr w:type="gramStart"/>
+      <w:r>
+        <w:rPr>
+          <w:lang w:val="es-MX"/>
+        </w:rPr>
+        <w:t>Análisis línea</w:t>
+      </w:r>
+      <w:proofErr w:type="gramEnd"/>
+      <w:r>
+        <w:rPr>
+          <w:lang w:val="es-MX"/>
+        </w:rPr>
+        <w:t xml:space="preserve"> por línea </w:t>
+      </w:r>
+      <w:r>
+        <w:rPr>
+          <w:rFonts w:ascii="Segoe UI Symbol" w:hAnsi="Segoe UI Symbol" w:cs="Segoe UI Symbol"/>
+          <w:lang w:val="es-MX"/>
+        </w:rPr>
+        <w:t>✅</w:t>
+      </w:r>
+    </w:p>
+    <w:p>
+      <w:pPr>
+        <w:pStyle w:val="font-claude-response-body"/>
+        <w:rPr>
+          <w:lang w:val="es-MX"/>
+        </w:rPr>
+      </w:pPr>
+      <w:r>
+        <w:rPr>
+          <w:rStyle w:val="CdigoHTML"/>
+          <w:b/>
+          <w:bCs/>
+          <w:lang w:val="es-MX"/>
+        </w:rPr>
+        <w:t>let client</w:t>
+      </w:r>
+      <w:r>
+        <w:rPr>
+          <w:lang w:val="es-MX"/>
+        </w:rPr>
+        <w:t xml:space="preserve"> — variable que guarda la conexión. Al estar fuera de la función, persiste entre llamadas. No se crea una nueva conexión cada vez.</w:t>
+      </w:r>
+    </w:p>
+    <w:p>
+      <w:pPr>
+        <w:pStyle w:val="font-claude-response-body"/>
+        <w:rPr>
+          <w:lang w:val="es-MX"/>
+        </w:rPr>
+      </w:pPr>
+      <w:r>
+        <w:rPr>
+          <w:rStyle w:val="CdigoHTML"/>
+          <w:b/>
+          <w:bCs/>
+          <w:lang w:val="es-MX"/>
+        </w:rPr>
+        <w:t xml:space="preserve">if (client &amp;&amp; </w:t>
+      </w:r>
+      <w:proofErr w:type="gramStart"/>
+      <w:r>
+        <w:rPr>
+          <w:rStyle w:val="CdigoHTML"/>
+          <w:b/>
+          <w:bCs/>
+          <w:lang w:val="es-MX"/>
+        </w:rPr>
+        <w:t>client.isOpen</w:t>
+      </w:r>
+      <w:proofErr w:type="gramEnd"/>
+      <w:r>
+        <w:rPr>
+          <w:rStyle w:val="CdigoHTML"/>
+          <w:b/>
+          <w:bCs/>
+          <w:lang w:val="es-MX"/>
+        </w:rPr>
+        <w:t>) return client</w:t>
+      </w:r>
+      <w:r>
+        <w:rPr>
+          <w:lang w:val="es-MX"/>
+        </w:rPr>
+        <w:t xml:space="preserve"> — patrón </w:t>
+      </w:r>
+      <w:r>
+        <w:rPr>
+          <w:rStyle w:val="Textoennegrita"/>
+          <w:lang w:val="es-MX"/>
+        </w:rPr>
+        <w:t>Singleton</w:t>
+      </w:r>
+      <w:r>
+        <w:rPr>
+          <w:lang w:val="es-MX"/>
+        </w:rPr>
+        <w:t>. Si ya existe una conexión abierta, la reutiliza. Sin esto, cada petición al servidor abriría una conexión nueva y agotarías Redis rápidamente. Menciona este patrón en tu tesis.</w:t>
+      </w:r>
+    </w:p>
+    <w:p>
+      <w:pPr>
+        <w:pStyle w:val="font-claude-response-body"/>
+        <w:rPr>
+          <w:lang w:val="es-MX"/>
+        </w:rPr>
+      </w:pPr>
+      <w:proofErr w:type="gramStart"/>
+      <w:r>
+        <w:rPr>
+          <w:rStyle w:val="CdigoHTML"/>
+          <w:b/>
+          <w:bCs/>
+          <w:lang w:val="es-MX"/>
+        </w:rPr>
+        <w:t>process.env.REDIS</w:t>
+      </w:r>
+      <w:proofErr w:type="gramEnd"/>
+      <w:r>
+        <w:rPr>
+          <w:rStyle w:val="CdigoHTML"/>
+          <w:b/>
+          <w:bCs/>
+          <w:lang w:val="es-MX"/>
+        </w:rPr>
+        <w:t>_URL || "redis://127.0.0.1:6379"</w:t>
+      </w:r>
+      <w:r>
+        <w:rPr>
+          <w:lang w:val="es-MX"/>
+        </w:rPr>
+        <w:t xml:space="preserve"> — si no hay variable de entorno, cae en localhost. Útil para desarrollo local sin Docker.</w:t>
+      </w:r>
+    </w:p>
+    <w:p>
+      <w:pPr>
+        <w:pStyle w:val="font-claude-response-body"/>
+      </w:pPr>
+      <w:proofErr w:type="gramStart"/>
+      <w:r>
+        <w:rPr>
+          <w:rStyle w:val="CdigoHTML"/>
+          <w:b/>
+          <w:bCs/>
+          <w:lang w:val="es-MX"/>
+        </w:rPr>
+        <w:t>client.on</w:t>
+      </w:r>
+      <w:proofErr w:type="gramEnd"/>
+      <w:r>
+        <w:rPr>
+          <w:rStyle w:val="CdigoHTML"/>
+          <w:b/>
+          <w:bCs/>
+          <w:lang w:val="es-MX"/>
+        </w:rPr>
+        <w:t>("error", ...)</w:t>
+      </w:r>
+      <w:r>
+        <w:rPr>
+          <w:lang w:val="es-MX"/>
+        </w:rPr>
+        <w:t xml:space="preserve"> — captura errores de Redis sin crashear el servidor. </w:t>
+      </w:r>
+      <w:r>
+        <w:t xml:space="preserve">El </w:t>
+      </w:r>
+      <w:proofErr w:type="spellStart"/>
+      <w:r>
+        <w:t>servicio</w:t>
+      </w:r>
+      <w:proofErr w:type="spellEnd"/>
+      <w:r>
+        <w:t xml:space="preserve"> </w:t>
+      </w:r>
+      <w:proofErr w:type="spellStart"/>
+      <w:r>
+        <w:t>sigue</w:t>
+      </w:r>
+      <w:proofErr w:type="spellEnd"/>
+      <w:r>
+        <w:t xml:space="preserve"> </w:t>
+      </w:r>
+      <w:proofErr w:type="spellStart"/>
+      <w:r>
+        <w:t>funcionando</w:t>
+      </w:r>
+      <w:proofErr w:type="spellEnd"/>
+      <w:r>
+        <w:t xml:space="preserve"> </w:t>
+      </w:r>
+      <w:proofErr w:type="spellStart"/>
+      <w:r>
+        <w:t>aunque</w:t>
+      </w:r>
+      <w:proofErr w:type="spellEnd"/>
+      <w:r>
+        <w:t xml:space="preserve"> </w:t>
+      </w:r>
+      <w:proofErr w:type="spellStart"/>
+      <w:r>
+        <w:t>Redis</w:t>
+      </w:r>
+      <w:proofErr w:type="spellEnd"/>
+      <w:r>
+        <w:t xml:space="preserve"> </w:t>
+      </w:r>
+      <w:proofErr w:type="spellStart"/>
+      <w:r>
+        <w:t>falle</w:t>
+      </w:r>
+      <w:proofErr w:type="spellEnd"/>
+      <w:r>
+        <w:t xml:space="preserve"> </w:t>
+      </w:r>
+      <w:proofErr w:type="spellStart"/>
+      <w:r>
+        <w:t>momentáneamente</w:t>
+      </w:r>
+      <w:proofErr w:type="spellEnd"/>
+      <w:r>
+        <w:t>.</w:t>
+      </w:r>
+    </w:p>
+    <w:p>
+      <w:pPr>
+        <w:pStyle w:val="font-claude-response-body"/>
+        <w:rPr>
+          <w:lang w:val="es-MX"/>
+        </w:rPr>
+      </w:pPr>
+      <w:bookmarkStart w:id="0" w:name="_GoBack"/>
+      <w:bookmarkEnd w:id="0"/>
+    </w:p>
+    <w:p>
+      <w:pPr>
+        <w:rPr>
+          <w:lang w:val="es-MX"/>
+        </w:rPr>
+      </w:pPr>
+    </w:p>
+    <w:p>
+      <w:pPr>
+        <w:rPr>
+          <w:lang w:val="es-MX"/>
+        </w:rPr>
+      </w:pPr>
+      <w:r>
+        <w:rPr>
+          <w:lang w:val="es-MX"/>
+        </w:rPr>
+        <w:t xml:space="preserve">Necesito hacer una APP que contenga una IA que funcione offline que sirva para recibir historias clínicas de un consultorio optometrista, cuando tenga conexión deberá sincronizar con una base de datos que ya tengo configurada en Mongo Atlas. Me vas a explicar paso por paso porque es para mi tesis y necesito saber TODO y auditar todo. Me ayudas a fabricar el código y me explicas </w:t>
+      </w:r>
+      <w:r>
+        <w:rPr>
+          <w:lang w:val="es-MX"/>
+        </w:rPr>
+        <w:lastRenderedPageBreak/>
+        <w:t xml:space="preserve">línea por línea dándome maneras creativas de realizar para que yo pueda aprender y asimismo aprobar. Necesito también subir este proyecto cada progreso que haga al </w:t>
       </w:r>
       <w:proofErr w:type="spellStart"/>
       <w:r>
@@ -2181,7 +3266,6 @@
           <w:bCs/>
           <w:lang w:val="es-MX"/>
         </w:rPr>
-        <w:lastRenderedPageBreak/>
         <w:t>Servicio de Autenticación (</w:t>
       </w:r>
       <w:proofErr w:type="spellStart"/>
@@ -2555,6 +3639,7 @@
           <w:bCs/>
           <w:lang w:val="es-MX"/>
         </w:rPr>
+        <w:lastRenderedPageBreak/>
         <w:t>Resolución de Conflictos:</w:t>
       </w:r>
       <w:r>
@@ -2892,11 +3977,9 @@
       </w:pPr>
     </w:p>
     <w:p>
-      <w:bookmarkStart w:id="0" w:name="_GoBack"/>
       <w:r>
         <w:t>docker exec -it &lt;athenea-postgres&gt; psql -U athenea -d authdb</w:t>
       </w:r>
-      <w:bookmarkEnd w:id="0"/>
     </w:p>
     <w:sectPr>
       <w:pgSz w:w="12240" w:h="15840"/>

</xml_diff>

<commit_message>
Inicio de expo app y Athenea APPprimera fase
</commit_message>
<xml_diff>
--- a/Explicacion_Microservicios.docx
+++ b/Explicacion_Microservicios.docx
@@ -1174,7 +1174,6 @@
         <w:t xml:space="preserve"> app = </w:t>
       </w:r>
       <w:proofErr w:type="spellStart"/>
-      <w:proofErr w:type="gramStart"/>
       <w:r>
         <w:rPr>
           <w:rStyle w:val="CdigoHTML"/>
@@ -1188,21 +1187,59 @@
           <w:rStyle w:val="CdigoHTML"/>
           <w:lang w:val="es-MX"/>
         </w:rPr>
+        <w:t>()</w:t>
+      </w:r>
+      <w:r>
+        <w:rPr>
+          <w:lang w:val="es-MX"/>
+        </w:rPr>
+        <w:t xml:space="preserve"> — crea tu aplicación web. Todo el sistema arranca desde esta línea.</w:t>
+      </w:r>
+    </w:p>
+    <w:p>
+      <w:pPr>
+        <w:pStyle w:val="font-claude-response-body"/>
+        <w:rPr>
+          <w:lang w:val="es-MX"/>
+        </w:rPr>
+      </w:pPr>
+      <w:proofErr w:type="spellStart"/>
+      <w:r>
+        <w:rPr>
+          <w:rStyle w:val="CdigoHTML"/>
+          <w:lang w:val="es-MX"/>
+        </w:rPr>
+        <w:t>app.use</w:t>
+      </w:r>
+      <w:proofErr w:type="spellEnd"/>
+      <w:r>
+        <w:rPr>
+          <w:rStyle w:val="CdigoHTML"/>
+          <w:lang w:val="es-MX"/>
+        </w:rPr>
         <w:t>(</w:t>
       </w:r>
-      <w:proofErr w:type="gramEnd"/>
-      <w:r>
-        <w:rPr>
-          <w:rStyle w:val="CdigoHTML"/>
-          <w:lang w:val="es-MX"/>
-        </w:rPr>
-        <w:t>)</w:t>
-      </w:r>
-      <w:r>
-        <w:rPr>
-          <w:lang w:val="es-MX"/>
-        </w:rPr>
-        <w:t xml:space="preserve"> — crea tu aplicación web. Todo el sistema arranca desde esta línea.</w:t>
+      <w:proofErr w:type="spellStart"/>
+      <w:r>
+        <w:rPr>
+          <w:rStyle w:val="CdigoHTML"/>
+          <w:lang w:val="es-MX"/>
+        </w:rPr>
+        <w:t>express.json</w:t>
+      </w:r>
+      <w:proofErr w:type="spellEnd"/>
+      <w:r>
+        <w:rPr>
+          <w:rStyle w:val="CdigoHTML"/>
+          <w:lang w:val="es-MX"/>
+        </w:rPr>
+        <w:t>())</w:t>
+      </w:r>
+      <w:r>
+        <w:rPr>
+          <w:lang w:val="es-MX"/>
+        </w:rPr>
+        <w:t xml:space="preserve"> — le dice a Express que entienda JSON. Sin esto, cuando la app móvil envíe datos en formato JSON, tu servidor no los podría leer.</w:t>
       </w:r>
     </w:p>
     <w:p>
@@ -1218,39 +1255,73 @@
           <w:rStyle w:val="CdigoHTML"/>
           <w:lang w:val="es-MX"/>
         </w:rPr>
-        <w:t>app.use</w:t>
-      </w:r>
-      <w:proofErr w:type="spellEnd"/>
-      <w:r>
-        <w:rPr>
-          <w:rStyle w:val="CdigoHTML"/>
-          <w:lang w:val="es-MX"/>
-        </w:rPr>
-        <w:t>(</w:t>
-      </w:r>
-      <w:proofErr w:type="spellStart"/>
-      <w:proofErr w:type="gramStart"/>
-      <w:r>
-        <w:rPr>
-          <w:rStyle w:val="CdigoHTML"/>
-          <w:lang w:val="es-MX"/>
-        </w:rPr>
-        <w:t>express.json</w:t>
-      </w:r>
-      <w:proofErr w:type="spellEnd"/>
-      <w:proofErr w:type="gramEnd"/>
-      <w:r>
-        <w:rPr>
-          <w:rStyle w:val="CdigoHTML"/>
-          <w:lang w:val="es-MX"/>
-        </w:rPr>
-        <w:t>())</w:t>
-      </w:r>
-      <w:r>
-        <w:rPr>
-          <w:lang w:val="es-MX"/>
-        </w:rPr>
-        <w:t xml:space="preserve"> — le dice a Express que entienda JSON. Sin esto, cuando la app móvil envíe datos en formato JSON, tu servidor no los podría leer.</w:t>
+        <w:t>app.get</w:t>
+      </w:r>
+      <w:proofErr w:type="spellEnd"/>
+      <w:r>
+        <w:rPr>
+          <w:rStyle w:val="CdigoHTML"/>
+          <w:lang w:val="es-MX"/>
+        </w:rPr>
+        <w:t>('/</w:t>
+      </w:r>
+      <w:proofErr w:type="spellStart"/>
+      <w:r>
+        <w:rPr>
+          <w:rStyle w:val="CdigoHTML"/>
+          <w:lang w:val="es-MX"/>
+        </w:rPr>
+        <w:t>health</w:t>
+      </w:r>
+      <w:proofErr w:type="spellEnd"/>
+      <w:r>
+        <w:rPr>
+          <w:rStyle w:val="CdigoHTML"/>
+          <w:lang w:val="es-MX"/>
+        </w:rPr>
+        <w:t>', ...)</w:t>
+      </w:r>
+      <w:r>
+        <w:rPr>
+          <w:lang w:val="es-MX"/>
+        </w:rPr>
+        <w:t xml:space="preserve"> — crea una ruta de prueba. Cuando alguien visita </w:t>
+      </w:r>
+      <w:r>
+        <w:rPr>
+          <w:rStyle w:val="CdigoHTML"/>
+          <w:lang w:val="es-MX"/>
+        </w:rPr>
+        <w:t>/</w:t>
+      </w:r>
+      <w:proofErr w:type="spellStart"/>
+      <w:r>
+        <w:rPr>
+          <w:rStyle w:val="CdigoHTML"/>
+          <w:lang w:val="es-MX"/>
+        </w:rPr>
+        <w:t>health</w:t>
+      </w:r>
+      <w:proofErr w:type="spellEnd"/>
+      <w:r>
+        <w:rPr>
+          <w:lang w:val="es-MX"/>
+        </w:rPr>
+        <w:t xml:space="preserve">, el servidor responde que está vivo. Es una práctica estándar en </w:t>
+      </w:r>
+      <w:proofErr w:type="spellStart"/>
+      <w:r>
+        <w:rPr>
+          <w:lang w:val="es-MX"/>
+        </w:rPr>
+        <w:t>microservicios</w:t>
+      </w:r>
+      <w:proofErr w:type="spellEnd"/>
+      <w:r>
+        <w:rPr>
+          <w:lang w:val="es-MX"/>
+        </w:rPr>
+        <w:t xml:space="preserve"> para verificar que el servicio funciona.</w:t>
       </w:r>
     </w:p>
     <w:p>
@@ -1261,87 +1332,61 @@
         </w:rPr>
       </w:pPr>
       <w:proofErr w:type="spellStart"/>
-      <w:proofErr w:type="gramStart"/>
-      <w:r>
-        <w:rPr>
-          <w:rStyle w:val="CdigoHTML"/>
-          <w:lang w:val="es-MX"/>
-        </w:rPr>
-        <w:t>app.get</w:t>
-      </w:r>
-      <w:proofErr w:type="spellEnd"/>
-      <w:r>
-        <w:rPr>
-          <w:rStyle w:val="CdigoHTML"/>
-          <w:lang w:val="es-MX"/>
-        </w:rPr>
-        <w:t>(</w:t>
-      </w:r>
-      <w:proofErr w:type="gramEnd"/>
-      <w:r>
-        <w:rPr>
-          <w:rStyle w:val="CdigoHTML"/>
-          <w:lang w:val="es-MX"/>
-        </w:rPr>
-        <w:t>'/</w:t>
-      </w:r>
-      <w:proofErr w:type="spellStart"/>
-      <w:r>
-        <w:rPr>
-          <w:rStyle w:val="CdigoHTML"/>
-          <w:lang w:val="es-MX"/>
-        </w:rPr>
-        <w:t>health</w:t>
-      </w:r>
-      <w:proofErr w:type="spellEnd"/>
-      <w:r>
-        <w:rPr>
-          <w:rStyle w:val="CdigoHTML"/>
-          <w:lang w:val="es-MX"/>
-        </w:rPr>
-        <w:t>', ...)</w:t>
-      </w:r>
-      <w:r>
-        <w:rPr>
-          <w:lang w:val="es-MX"/>
-        </w:rPr>
-        <w:t xml:space="preserve"> — crea una ruta de prueba. Cuando alguien visita </w:t>
-      </w:r>
-      <w:r>
-        <w:rPr>
-          <w:rStyle w:val="CdigoHTML"/>
-          <w:lang w:val="es-MX"/>
-        </w:rPr>
-        <w:t>/</w:t>
-      </w:r>
-      <w:proofErr w:type="spellStart"/>
-      <w:r>
-        <w:rPr>
-          <w:rStyle w:val="CdigoHTML"/>
-          <w:lang w:val="es-MX"/>
-        </w:rPr>
-        <w:t>health</w:t>
-      </w:r>
-      <w:proofErr w:type="spellEnd"/>
-      <w:r>
-        <w:rPr>
-          <w:lang w:val="es-MX"/>
-        </w:rPr>
-        <w:t xml:space="preserve">, el servidor responde que está vivo. Es una práctica estándar en </w:t>
-      </w:r>
-      <w:proofErr w:type="spellStart"/>
-      <w:r>
-        <w:rPr>
-          <w:lang w:val="es-MX"/>
-        </w:rPr>
-        <w:t>microservicios</w:t>
-      </w:r>
-      <w:proofErr w:type="spellEnd"/>
-      <w:r>
-        <w:rPr>
-          <w:lang w:val="es-MX"/>
-        </w:rPr>
-        <w:t xml:space="preserve"> para verificar que el servicio funciona.</w:t>
+      <w:r>
+        <w:rPr>
+          <w:rStyle w:val="CdigoHTML"/>
+          <w:lang w:val="es-MX"/>
+        </w:rPr>
+        <w:t>process.env.PORT</w:t>
+      </w:r>
+      <w:proofErr w:type="spellEnd"/>
+      <w:r>
+        <w:rPr>
+          <w:rStyle w:val="CdigoHTML"/>
+          <w:lang w:val="es-MX"/>
+        </w:rPr>
+        <w:t xml:space="preserve"> || 3001</w:t>
+      </w:r>
+      <w:r>
+        <w:rPr>
+          <w:lang w:val="es-MX"/>
+        </w:rPr>
+        <w:t xml:space="preserve"> — lee el puerto del </w:t>
+      </w:r>
+      <w:r>
+        <w:rPr>
+          <w:rStyle w:val="CdigoHTML"/>
+          <w:lang w:val="es-MX"/>
+        </w:rPr>
+        <w:t>.</w:t>
+      </w:r>
+      <w:proofErr w:type="spellStart"/>
+      <w:r>
+        <w:rPr>
+          <w:rStyle w:val="CdigoHTML"/>
+          <w:lang w:val="es-MX"/>
+        </w:rPr>
+        <w:t>env</w:t>
+      </w:r>
+      <w:proofErr w:type="spellEnd"/>
+      <w:r>
+        <w:rPr>
+          <w:lang w:val="es-MX"/>
+        </w:rPr>
+        <w:t xml:space="preserve">. Si no existe, usa 3001 por defecto. El </w:t>
+      </w:r>
+      <w:r>
+        <w:rPr>
+          <w:rStyle w:val="CdigoHTML"/>
+          <w:lang w:val="es-MX"/>
+        </w:rPr>
+        <w:t>||</w:t>
+      </w:r>
+      <w:r>
+        <w:rPr>
+          <w:lang w:val="es-MX"/>
+        </w:rPr>
+        <w:t xml:space="preserve"> significa "o si no".</w:t>
       </w:r>
     </w:p>
     <w:p>
@@ -1352,74 +1397,6 @@
         </w:rPr>
       </w:pPr>
       <w:proofErr w:type="spellStart"/>
-      <w:proofErr w:type="gramStart"/>
-      <w:r>
-        <w:rPr>
-          <w:rStyle w:val="CdigoHTML"/>
-          <w:lang w:val="es-MX"/>
-        </w:rPr>
-        <w:t>process.env.PORT</w:t>
-      </w:r>
-      <w:proofErr w:type="spellEnd"/>
-      <w:proofErr w:type="gramEnd"/>
-      <w:r>
-        <w:rPr>
-          <w:rStyle w:val="CdigoHTML"/>
-          <w:lang w:val="es-MX"/>
-        </w:rPr>
-        <w:t xml:space="preserve"> || 3001</w:t>
-      </w:r>
-      <w:r>
-        <w:rPr>
-          <w:lang w:val="es-MX"/>
-        </w:rPr>
-        <w:t xml:space="preserve"> — lee el puerto del </w:t>
-      </w:r>
-      <w:r>
-        <w:rPr>
-          <w:rStyle w:val="CdigoHTML"/>
-          <w:lang w:val="es-MX"/>
-        </w:rPr>
-        <w:t>.</w:t>
-      </w:r>
-      <w:proofErr w:type="spellStart"/>
-      <w:r>
-        <w:rPr>
-          <w:rStyle w:val="CdigoHTML"/>
-          <w:lang w:val="es-MX"/>
-        </w:rPr>
-        <w:t>env</w:t>
-      </w:r>
-      <w:proofErr w:type="spellEnd"/>
-      <w:r>
-        <w:rPr>
-          <w:lang w:val="es-MX"/>
-        </w:rPr>
-        <w:t xml:space="preserve">. Si no existe, usa 3001 por defecto. El </w:t>
-      </w:r>
-      <w:r>
-        <w:rPr>
-          <w:rStyle w:val="CdigoHTML"/>
-          <w:lang w:val="es-MX"/>
-        </w:rPr>
-        <w:t>||</w:t>
-      </w:r>
-      <w:r>
-        <w:rPr>
-          <w:lang w:val="es-MX"/>
-        </w:rPr>
-        <w:t xml:space="preserve"> significa "o si no".</w:t>
-      </w:r>
-    </w:p>
-    <w:p>
-      <w:pPr>
-        <w:pStyle w:val="font-claude-response-body"/>
-        <w:rPr>
-          <w:lang w:val="es-MX"/>
-        </w:rPr>
-      </w:pPr>
-      <w:proofErr w:type="spellStart"/>
-      <w:proofErr w:type="gramStart"/>
       <w:r>
         <w:rPr>
           <w:rStyle w:val="CdigoHTML"/>
@@ -1428,7 +1405,6 @@
         <w:t>app.listen</w:t>
       </w:r>
       <w:proofErr w:type="spellEnd"/>
-      <w:proofErr w:type="gramEnd"/>
       <w:r>
         <w:rPr>
           <w:rStyle w:val="CdigoHTML"/>
@@ -1536,14 +1512,7 @@
         <w:rPr>
           <w:lang w:val="es-MX"/>
         </w:rPr>
-        <w:t xml:space="preserve"> — intenta leer </w:t>
-      </w:r>
-      <w:proofErr w:type="gramStart"/>
-      <w:r>
-        <w:rPr>
-          <w:lang w:val="es-MX"/>
-        </w:rPr>
-        <w:t xml:space="preserve">del </w:t>
+        <w:t xml:space="preserve"> — intenta leer del </w:t>
       </w:r>
       <w:r>
         <w:rPr>
@@ -1561,7 +1530,6 @@
         <w:t>env</w:t>
       </w:r>
       <w:proofErr w:type="spellEnd"/>
-      <w:proofErr w:type="gramEnd"/>
       <w:r>
         <w:rPr>
           <w:lang w:val="es-MX"/>
@@ -1605,7 +1573,6 @@
         </w:rPr>
       </w:pPr>
       <w:proofErr w:type="spellStart"/>
-      <w:proofErr w:type="gramStart"/>
       <w:r>
         <w:rPr>
           <w:rStyle w:val="CdigoHTML"/>
@@ -1614,7 +1581,6 @@
         <w:t>pool.on</w:t>
       </w:r>
       <w:proofErr w:type="spellEnd"/>
-      <w:proofErr w:type="gramEnd"/>
       <w:r>
         <w:rPr>
           <w:rStyle w:val="CdigoHTML"/>
@@ -1667,7 +1633,6 @@
         </w:rPr>
       </w:pPr>
       <w:proofErr w:type="spellStart"/>
-      <w:proofErr w:type="gramStart"/>
       <w:r>
         <w:rPr>
           <w:rStyle w:val="CdigoHTML"/>
@@ -1676,7 +1641,6 @@
         <w:t>pool.on</w:t>
       </w:r>
       <w:proofErr w:type="spellEnd"/>
-      <w:proofErr w:type="gramEnd"/>
       <w:r>
         <w:rPr>
           <w:rStyle w:val="CdigoHTML"/>
@@ -1713,7 +1677,6 @@
         </w:rPr>
       </w:pPr>
       <w:proofErr w:type="spellStart"/>
-      <w:proofErr w:type="gramStart"/>
       <w:r>
         <w:rPr>
           <w:rStyle w:val="CdigoHTML"/>
@@ -1722,7 +1685,6 @@
         <w:t>module.exports</w:t>
       </w:r>
       <w:proofErr w:type="spellEnd"/>
-      <w:proofErr w:type="gramEnd"/>
       <w:r>
         <w:rPr>
           <w:rStyle w:val="CdigoHTML"/>
@@ -2059,14 +2021,7 @@
         <w:rPr>
           <w:lang w:val="es-MX"/>
         </w:rPr>
-        <w:t xml:space="preserve">Variables de entorno gestionadas </w:t>
-      </w:r>
-      <w:proofErr w:type="gramStart"/>
-      <w:r>
-        <w:rPr>
-          <w:lang w:val="es-MX"/>
-        </w:rPr>
-        <w:t>con .</w:t>
+        <w:t>Variables de entorno gestionadas con .</w:t>
       </w:r>
       <w:proofErr w:type="spellStart"/>
       <w:r>
@@ -2076,7 +2031,6 @@
         <w:t>env</w:t>
       </w:r>
       <w:proofErr w:type="spellEnd"/>
-      <w:proofErr w:type="gramEnd"/>
       <w:r>
         <w:rPr>
           <w:lang w:val="es-MX"/>
@@ -2150,7 +2104,6 @@
         </w:rPr>
       </w:pPr>
       <w:proofErr w:type="spellStart"/>
-      <w:proofErr w:type="gramStart"/>
       <w:r>
         <w:rPr>
           <w:rStyle w:val="CdigoHTML"/>
@@ -2168,64 +2121,326 @@
           <w:bCs/>
           <w:lang w:val="es-MX"/>
         </w:rPr>
+        <w:t>()</w:t>
+      </w:r>
+      <w:r>
+        <w:rPr>
+          <w:lang w:val="es-MX"/>
+        </w:rPr>
+        <w:t xml:space="preserve"> — antes de arrancar el servidor, verifica que las variables críticas existen. Si falta </w:t>
+      </w:r>
+      <w:r>
+        <w:rPr>
+          <w:rStyle w:val="CdigoHTML"/>
+          <w:lang w:val="es-MX"/>
+        </w:rPr>
+        <w:t>DATABASE_URL</w:t>
+      </w:r>
+      <w:r>
+        <w:rPr>
+          <w:lang w:val="es-MX"/>
+        </w:rPr>
+        <w:t xml:space="preserve"> o </w:t>
+      </w:r>
+      <w:r>
+        <w:rPr>
+          <w:rStyle w:val="CdigoHTML"/>
+          <w:lang w:val="es-MX"/>
+        </w:rPr>
+        <w:t>JWT_SECRET</w:t>
+      </w:r>
+      <w:r>
+        <w:rPr>
+          <w:lang w:val="es-MX"/>
+        </w:rPr>
+        <w:t xml:space="preserve">, el proceso muere con un mensaje claro en lugar de fallar misteriosamente después. Eso se llama </w:t>
+      </w:r>
+      <w:proofErr w:type="spellStart"/>
+      <w:r>
+        <w:rPr>
+          <w:rStyle w:val="Textoennegrita"/>
+          <w:lang w:val="es-MX"/>
+        </w:rPr>
+        <w:t>fail-fast</w:t>
+      </w:r>
+      <w:proofErr w:type="spellEnd"/>
+      <w:r>
+        <w:rPr>
+          <w:lang w:val="es-MX"/>
+        </w:rPr>
+        <w:t xml:space="preserve"> y es un patrón profesional.</w:t>
+      </w:r>
+    </w:p>
+    <w:p>
+      <w:pPr>
+        <w:pStyle w:val="font-claude-response-body"/>
+        <w:rPr>
+          <w:lang w:val="es-MX"/>
+        </w:rPr>
+      </w:pPr>
+      <w:proofErr w:type="spellStart"/>
+      <w:r>
+        <w:rPr>
+          <w:rStyle w:val="CdigoHTML"/>
+          <w:b/>
+          <w:bCs/>
+          <w:lang w:val="es-MX"/>
+        </w:rPr>
+        <w:t>bcrypt.hash</w:t>
+      </w:r>
+      <w:proofErr w:type="spellEnd"/>
+      <w:r>
+        <w:rPr>
+          <w:rStyle w:val="CdigoHTML"/>
+          <w:b/>
+          <w:bCs/>
+          <w:lang w:val="es-MX"/>
+        </w:rPr>
         <w:t>(</w:t>
       </w:r>
-      <w:proofErr w:type="gramEnd"/>
-      <w:r>
-        <w:rPr>
-          <w:rStyle w:val="CdigoHTML"/>
-          <w:b/>
-          <w:bCs/>
-          <w:lang w:val="es-MX"/>
-        </w:rPr>
-        <w:t>)</w:t>
-      </w:r>
-      <w:r>
-        <w:rPr>
-          <w:lang w:val="es-MX"/>
-        </w:rPr>
-        <w:t xml:space="preserve"> — antes de arrancar el servidor, verifica que las variables críticas existen. Si falta </w:t>
-      </w:r>
-      <w:r>
-        <w:rPr>
-          <w:rStyle w:val="CdigoHTML"/>
-          <w:lang w:val="es-MX"/>
-        </w:rPr>
-        <w:t>DATABASE_URL</w:t>
-      </w:r>
-      <w:r>
-        <w:rPr>
-          <w:lang w:val="es-MX"/>
-        </w:rPr>
-        <w:t xml:space="preserve"> o </w:t>
-      </w:r>
-      <w:r>
-        <w:rPr>
-          <w:rStyle w:val="CdigoHTML"/>
-          <w:lang w:val="es-MX"/>
-        </w:rPr>
-        <w:t>JWT_SECRET</w:t>
-      </w:r>
-      <w:r>
-        <w:rPr>
-          <w:lang w:val="es-MX"/>
-        </w:rPr>
-        <w:t xml:space="preserve">, el proceso muere con un mensaje claro en lugar de fallar misteriosamente después. Eso se llama </w:t>
-      </w:r>
+      <w:proofErr w:type="spellStart"/>
+      <w:r>
+        <w:rPr>
+          <w:rStyle w:val="CdigoHTML"/>
+          <w:b/>
+          <w:bCs/>
+          <w:lang w:val="es-MX"/>
+        </w:rPr>
+        <w:t>password</w:t>
+      </w:r>
+      <w:proofErr w:type="spellEnd"/>
+      <w:r>
+        <w:rPr>
+          <w:rStyle w:val="CdigoHTML"/>
+          <w:b/>
+          <w:bCs/>
+          <w:lang w:val="es-MX"/>
+        </w:rPr>
+        <w:t>, 12)</w:t>
+      </w:r>
+      <w:r>
+        <w:rPr>
+          <w:lang w:val="es-MX"/>
+        </w:rPr>
+        <w:t xml:space="preserve"> — el número </w:t>
+      </w:r>
+      <w:r>
+        <w:rPr>
+          <w:rStyle w:val="CdigoHTML"/>
+          <w:lang w:val="es-MX"/>
+        </w:rPr>
+        <w:t>12</w:t>
+      </w:r>
+      <w:r>
+        <w:rPr>
+          <w:lang w:val="es-MX"/>
+        </w:rPr>
+        <w:t xml:space="preserve"> es el "</w:t>
+      </w:r>
+      <w:proofErr w:type="spellStart"/>
+      <w:r>
+        <w:rPr>
+          <w:lang w:val="es-MX"/>
+        </w:rPr>
+        <w:t>salt</w:t>
+      </w:r>
+      <w:proofErr w:type="spellEnd"/>
+      <w:r>
+        <w:rPr>
+          <w:lang w:val="es-MX"/>
+        </w:rPr>
+        <w:t xml:space="preserve"> rounds", cuántas veces se procesa el hash. A mayor número, más seguro pero más lento. 12 es el estándar de la industria para 2024. Nunca guardas la contraseña real.</w:t>
+      </w:r>
+    </w:p>
+    <w:p>
+      <w:pPr>
+        <w:pStyle w:val="font-claude-response-body"/>
+        <w:rPr>
+          <w:lang w:val="es-MX"/>
+        </w:rPr>
+      </w:pPr>
+      <w:proofErr w:type="spellStart"/>
+      <w:r>
+        <w:rPr>
+          <w:rStyle w:val="CdigoHTML"/>
+          <w:b/>
+          <w:bCs/>
+          <w:lang w:val="es-MX"/>
+        </w:rPr>
+        <w:t>email.toLowerCase</w:t>
+      </w:r>
+      <w:proofErr w:type="spellEnd"/>
+      <w:r>
+        <w:rPr>
+          <w:rStyle w:val="CdigoHTML"/>
+          <w:b/>
+          <w:bCs/>
+          <w:lang w:val="es-MX"/>
+        </w:rPr>
+        <w:t>()</w:t>
+      </w:r>
+      <w:r>
+        <w:rPr>
+          <w:lang w:val="es-MX"/>
+        </w:rPr>
+        <w:t xml:space="preserve"> — normaliza el email antes de guardarlo. Evita que </w:t>
+      </w:r>
+      <w:r>
+        <w:rPr>
+          <w:rStyle w:val="CdigoHTML"/>
+          <w:lang w:val="es-MX"/>
+        </w:rPr>
+        <w:t>Usuario@gmail.com</w:t>
+      </w:r>
+      <w:r>
+        <w:rPr>
+          <w:lang w:val="es-MX"/>
+        </w:rPr>
+        <w:t xml:space="preserve"> y </w:t>
+      </w:r>
+      <w:r>
+        <w:rPr>
+          <w:rStyle w:val="CdigoHTML"/>
+          <w:lang w:val="es-MX"/>
+        </w:rPr>
+        <w:t>usuario@gmail.com</w:t>
+      </w:r>
+      <w:r>
+        <w:rPr>
+          <w:lang w:val="es-MX"/>
+        </w:rPr>
+        <w:t xml:space="preserve"> sean tratados como cuentas distintas.</w:t>
+      </w:r>
+    </w:p>
+    <w:p>
+      <w:pPr>
+        <w:pStyle w:val="font-claude-response-body"/>
+        <w:rPr>
+          <w:lang w:val="es-MX"/>
+        </w:rPr>
+      </w:pPr>
+      <w:proofErr w:type="spellStart"/>
+      <w:r>
+        <w:rPr>
+          <w:rStyle w:val="CdigoHTML"/>
+          <w:b/>
+          <w:bCs/>
+          <w:lang w:val="es-MX"/>
+        </w:rPr>
+        <w:t>e.code</w:t>
+      </w:r>
+      <w:proofErr w:type="spellEnd"/>
+      <w:r>
+        <w:rPr>
+          <w:rStyle w:val="CdigoHTML"/>
+          <w:b/>
+          <w:bCs/>
+          <w:lang w:val="es-MX"/>
+        </w:rPr>
+        <w:t xml:space="preserve"> === "23505"</w:t>
+      </w:r>
+      <w:r>
+        <w:rPr>
+          <w:lang w:val="es-MX"/>
+        </w:rPr>
+        <w:t xml:space="preserve"> — ese es el código de error de </w:t>
+      </w:r>
+      <w:proofErr w:type="spellStart"/>
+      <w:r>
+        <w:rPr>
+          <w:lang w:val="es-MX"/>
+        </w:rPr>
+        <w:t>PostgreSQL</w:t>
+      </w:r>
+      <w:proofErr w:type="spellEnd"/>
+      <w:r>
+        <w:rPr>
+          <w:lang w:val="es-MX"/>
+        </w:rPr>
+        <w:t xml:space="preserve"> para violación de unicidad. En lugar de dejar caer el servidor, lo capturas y devuelves un 409 limpio. Excelente manejo de errores.</w:t>
+      </w:r>
+    </w:p>
+    <w:p>
+      <w:pPr>
+        <w:pStyle w:val="font-claude-response-body"/>
+        <w:rPr>
+          <w:lang w:val="es-MX"/>
+        </w:rPr>
+      </w:pPr>
       <w:proofErr w:type="spellStart"/>
       <w:r>
         <w:rPr>
           <w:rStyle w:val="Textoennegrita"/>
           <w:lang w:val="es-MX"/>
         </w:rPr>
-        <w:t>fail-fast</w:t>
-      </w:r>
-      <w:proofErr w:type="spellEnd"/>
-      <w:r>
-        <w:rPr>
-          <w:lang w:val="es-MX"/>
-        </w:rPr>
-        <w:t xml:space="preserve"> y es un patrón profesional.</w:t>
+        <w:t>Redis</w:t>
+      </w:r>
+      <w:proofErr w:type="spellEnd"/>
+      <w:r>
+        <w:rPr>
+          <w:rStyle w:val="Textoennegrita"/>
+          <w:lang w:val="es-MX"/>
+        </w:rPr>
+        <w:t xml:space="preserve"> con </w:t>
+      </w:r>
+      <w:proofErr w:type="spellStart"/>
+      <w:r>
+        <w:rPr>
+          <w:rStyle w:val="CdigoHTML"/>
+          <w:b/>
+          <w:bCs/>
+          <w:lang w:val="es-MX"/>
+        </w:rPr>
+        <w:t>setEx</w:t>
+      </w:r>
+      <w:proofErr w:type="spellEnd"/>
+      <w:r>
+        <w:rPr>
+          <w:lang w:val="es-MX"/>
+        </w:rPr>
+        <w:t xml:space="preserve"> — guarda la sesión con expiración de 8 horas, igual que el JWT. Eso permite hacer </w:t>
+      </w:r>
+      <w:proofErr w:type="spellStart"/>
+      <w:r>
+        <w:rPr>
+          <w:lang w:val="es-MX"/>
+        </w:rPr>
+        <w:t>logout</w:t>
+      </w:r>
+      <w:proofErr w:type="spellEnd"/>
+      <w:r>
+        <w:rPr>
+          <w:lang w:val="es-MX"/>
+        </w:rPr>
+        <w:t xml:space="preserve"> real invalidando la sesión en </w:t>
+      </w:r>
+      <w:proofErr w:type="spellStart"/>
+      <w:r>
+        <w:rPr>
+          <w:lang w:val="es-MX"/>
+        </w:rPr>
+        <w:t>Redis</w:t>
+      </w:r>
+      <w:proofErr w:type="spellEnd"/>
+      <w:r>
+        <w:rPr>
+          <w:lang w:val="es-MX"/>
+        </w:rPr>
+        <w:t xml:space="preserve"> sin esperar a que expire el </w:t>
+      </w:r>
+      <w:proofErr w:type="spellStart"/>
+      <w:r>
+        <w:rPr>
+          <w:lang w:val="es-MX"/>
+        </w:rPr>
+        <w:t>token</w:t>
+      </w:r>
+      <w:proofErr w:type="spellEnd"/>
+      <w:r>
+        <w:rPr>
+          <w:lang w:val="es-MX"/>
+        </w:rPr>
+        <w:t>.</w:t>
       </w:r>
     </w:p>
     <w:p>
@@ -2235,94 +2450,84 @@
           <w:lang w:val="es-MX"/>
         </w:rPr>
       </w:pPr>
-      <w:proofErr w:type="spellStart"/>
-      <w:proofErr w:type="gramStart"/>
-      <w:r>
-        <w:rPr>
-          <w:rStyle w:val="CdigoHTML"/>
-          <w:b/>
-          <w:bCs/>
-          <w:lang w:val="es-MX"/>
-        </w:rPr>
-        <w:t>bcrypt.hash</w:t>
-      </w:r>
-      <w:proofErr w:type="spellEnd"/>
-      <w:proofErr w:type="gramEnd"/>
-      <w:r>
-        <w:rPr>
-          <w:rStyle w:val="CdigoHTML"/>
-          <w:b/>
-          <w:bCs/>
-          <w:lang w:val="es-MX"/>
-        </w:rPr>
-        <w:t>(</w:t>
-      </w:r>
-      <w:proofErr w:type="spellStart"/>
-      <w:r>
-        <w:rPr>
-          <w:rStyle w:val="CdigoHTML"/>
-          <w:b/>
-          <w:bCs/>
-          <w:lang w:val="es-MX"/>
-        </w:rPr>
-        <w:t>password</w:t>
-      </w:r>
-      <w:proofErr w:type="spellEnd"/>
-      <w:r>
-        <w:rPr>
-          <w:rStyle w:val="CdigoHTML"/>
-          <w:b/>
-          <w:bCs/>
-          <w:lang w:val="es-MX"/>
-        </w:rPr>
-        <w:t>, 12)</w:t>
-      </w:r>
-      <w:r>
-        <w:rPr>
-          <w:lang w:val="es-MX"/>
-        </w:rPr>
-        <w:t xml:space="preserve"> — el número </w:t>
-      </w:r>
-      <w:r>
-        <w:rPr>
-          <w:rStyle w:val="CdigoHTML"/>
-          <w:lang w:val="es-MX"/>
-        </w:rPr>
-        <w:t>12</w:t>
-      </w:r>
-      <w:r>
-        <w:rPr>
-          <w:lang w:val="es-MX"/>
-        </w:rPr>
-        <w:t xml:space="preserve"> es el "</w:t>
-      </w:r>
-      <w:proofErr w:type="spellStart"/>
-      <w:r>
-        <w:rPr>
-          <w:lang w:val="es-MX"/>
-        </w:rPr>
-        <w:t>salt</w:t>
-      </w:r>
-      <w:proofErr w:type="spellEnd"/>
-      <w:r>
-        <w:rPr>
-          <w:lang w:val="es-MX"/>
-        </w:rPr>
-        <w:t xml:space="preserve"> rounds", cuántas veces se procesa el hash. A mayor número, más </w:t>
-      </w:r>
-      <w:proofErr w:type="gramStart"/>
-      <w:r>
-        <w:rPr>
-          <w:lang w:val="es-MX"/>
-        </w:rPr>
-        <w:t>seguro</w:t>
-      </w:r>
-      <w:proofErr w:type="gramEnd"/>
-      <w:r>
-        <w:rPr>
-          <w:lang w:val="es-MX"/>
-        </w:rPr>
-        <w:t xml:space="preserve"> pero más lento. 12 es el estándar de la industria para 2024. Nunca guardas la contraseña real.</w:t>
+      <w:r>
+        <w:rPr>
+          <w:rStyle w:val="CdigoHTML"/>
+          <w:b/>
+          <w:bCs/>
+          <w:lang w:val="es-MX"/>
+        </w:rPr>
+        <w:t>"0.0.0.0"</w:t>
+      </w:r>
+      <w:r>
+        <w:rPr>
+          <w:lang w:val="es-MX"/>
+        </w:rPr>
+        <w:t xml:space="preserve"> en </w:t>
+      </w:r>
+      <w:proofErr w:type="spellStart"/>
+      <w:r>
+        <w:rPr>
+          <w:rStyle w:val="CdigoHTML"/>
+          <w:lang w:val="es-MX"/>
+        </w:rPr>
+        <w:t>app.listen</w:t>
+      </w:r>
+      <w:proofErr w:type="spellEnd"/>
+      <w:r>
+        <w:rPr>
+          <w:lang w:val="es-MX"/>
+        </w:rPr>
+        <w:t xml:space="preserve"> — escucha en todas las interfaces de red del contenedor, necesario para que </w:t>
+      </w:r>
+      <w:proofErr w:type="spellStart"/>
+      <w:r>
+        <w:rPr>
+          <w:lang w:val="es-MX"/>
+        </w:rPr>
+        <w:t>Docker</w:t>
+      </w:r>
+      <w:proofErr w:type="spellEnd"/>
+      <w:r>
+        <w:rPr>
+          <w:lang w:val="es-MX"/>
+        </w:rPr>
+        <w:t xml:space="preserve"> pueda </w:t>
+      </w:r>
+      <w:proofErr w:type="spellStart"/>
+      <w:r>
+        <w:rPr>
+          <w:lang w:val="es-MX"/>
+        </w:rPr>
+        <w:t>enrutar</w:t>
+      </w:r>
+      <w:proofErr w:type="spellEnd"/>
+      <w:r>
+        <w:rPr>
+          <w:lang w:val="es-MX"/>
+        </w:rPr>
+        <w:t xml:space="preserve"> tráfico hacia él.</w:t>
+      </w:r>
+    </w:p>
+    <w:p>
+      <w:pPr>
+        <w:pStyle w:val="Ttulo3"/>
+        <w:rPr>
+          <w:lang w:val="es-MX"/>
+        </w:rPr>
+      </w:pPr>
+      <w:r>
+        <w:rPr>
+          <w:lang w:val="es-MX"/>
+        </w:rPr>
+        <w:t xml:space="preserve">Análisis línea por línea </w:t>
+      </w:r>
+      <w:r>
+        <w:rPr>
+          <w:rFonts w:ascii="Segoe UI Symbol" w:hAnsi="Segoe UI Symbol" w:cs="Segoe UI Symbol"/>
+          <w:lang w:val="es-MX"/>
+        </w:rPr>
+        <w:t>✅</w:t>
       </w:r>
     </w:p>
     <w:p>
@@ -2332,59 +2537,20 @@
           <w:lang w:val="es-MX"/>
         </w:rPr>
       </w:pPr>
-      <w:proofErr w:type="spellStart"/>
-      <w:proofErr w:type="gramStart"/>
-      <w:r>
-        <w:rPr>
-          <w:rStyle w:val="CdigoHTML"/>
-          <w:b/>
-          <w:bCs/>
-          <w:lang w:val="es-MX"/>
-        </w:rPr>
-        <w:t>email.toLowerCase</w:t>
-      </w:r>
-      <w:proofErr w:type="spellEnd"/>
-      <w:proofErr w:type="gramEnd"/>
-      <w:r>
-        <w:rPr>
-          <w:rStyle w:val="CdigoHTML"/>
-          <w:b/>
-          <w:bCs/>
-          <w:lang w:val="es-MX"/>
-        </w:rPr>
-        <w:t>()</w:t>
-      </w:r>
-      <w:r>
-        <w:rPr>
-          <w:lang w:val="es-MX"/>
-        </w:rPr>
-        <w:t xml:space="preserve"> — normaliza el email antes de guardarlo. Evita que </w:t>
-      </w:r>
-      <w:r>
-        <w:rPr>
-          <w:rStyle w:val="CdigoHTML"/>
-          <w:lang w:val="es-MX"/>
-        </w:rPr>
-        <w:t>Usuario@gmail.com</w:t>
-      </w:r>
-      <w:r>
-        <w:rPr>
-          <w:lang w:val="es-MX"/>
-        </w:rPr>
-        <w:t xml:space="preserve"> y </w:t>
-      </w:r>
-      <w:r>
-        <w:rPr>
-          <w:rStyle w:val="CdigoHTML"/>
-          <w:lang w:val="es-MX"/>
-        </w:rPr>
-        <w:t>usuario@gmail.com</w:t>
-      </w:r>
-      <w:r>
-        <w:rPr>
-          <w:lang w:val="es-MX"/>
-        </w:rPr>
-        <w:t xml:space="preserve"> sean tratados como cuentas distintas.</w:t>
+      <w:r>
+        <w:rPr>
+          <w:rStyle w:val="CdigoHTML"/>
+          <w:b/>
+          <w:bCs/>
+          <w:lang w:val="es-MX"/>
+        </w:rPr>
+        <w:t>let client</w:t>
+      </w:r>
+      <w:r>
+        <w:rPr>
+          <w:lang w:val="es-MX"/>
+        </w:rPr>
+        <w:t xml:space="preserve"> — variable que guarda la conexión. Al estar fuera de la función, persiste entre llamadas. No se crea una nueva conexión cada vez.</w:t>
       </w:r>
     </w:p>
     <w:p>
@@ -2394,47 +2560,33 @@
           <w:lang w:val="es-MX"/>
         </w:rPr>
       </w:pPr>
-      <w:proofErr w:type="spellStart"/>
-      <w:proofErr w:type="gramStart"/>
-      <w:r>
-        <w:rPr>
-          <w:rStyle w:val="CdigoHTML"/>
-          <w:b/>
-          <w:bCs/>
-          <w:lang w:val="es-MX"/>
-        </w:rPr>
-        <w:t>e.code</w:t>
-      </w:r>
-      <w:proofErr w:type="spellEnd"/>
-      <w:proofErr w:type="gramEnd"/>
-      <w:r>
-        <w:rPr>
-          <w:rStyle w:val="CdigoHTML"/>
-          <w:b/>
-          <w:bCs/>
-          <w:lang w:val="es-MX"/>
-        </w:rPr>
-        <w:t xml:space="preserve"> === "23505"</w:t>
-      </w:r>
-      <w:r>
-        <w:rPr>
-          <w:lang w:val="es-MX"/>
-        </w:rPr>
-        <w:t xml:space="preserve"> — ese es el código de error de </w:t>
-      </w:r>
-      <w:proofErr w:type="spellStart"/>
-      <w:r>
-        <w:rPr>
-          <w:lang w:val="es-MX"/>
-        </w:rPr>
-        <w:t>PostgreSQL</w:t>
-      </w:r>
-      <w:proofErr w:type="spellEnd"/>
-      <w:r>
-        <w:rPr>
-          <w:lang w:val="es-MX"/>
-        </w:rPr>
-        <w:t xml:space="preserve"> para violación de unicidad. En lugar de dejar caer el servidor, lo capturas y devuelves un 409 limpio. Excelente manejo de errores.</w:t>
+      <w:r>
+        <w:rPr>
+          <w:rStyle w:val="CdigoHTML"/>
+          <w:b/>
+          <w:bCs/>
+          <w:lang w:val="es-MX"/>
+        </w:rPr>
+        <w:t>if (client &amp;&amp; client.isOpen) return client</w:t>
+      </w:r>
+      <w:r>
+        <w:rPr>
+          <w:lang w:val="es-MX"/>
+        </w:rPr>
+        <w:t xml:space="preserve"> — patrón </w:t>
+      </w:r>
+      <w:r>
+        <w:rPr>
+          <w:rStyle w:val="Textoennegrita"/>
+          <w:lang w:val="es-MX"/>
+        </w:rPr>
+        <w:t>Singleton</w:t>
+      </w:r>
+      <w:r>
+        <w:rPr>
+          <w:lang w:val="es-MX"/>
+        </w:rPr>
+        <w:t>. Si ya existe una conexión abierta, la reutiliza. Sin esto, cada petición al servidor abriría una conexión nueva y agotarías Redis rápidamente. Menciona este patrón en tu tesis.</w:t>
       </w:r>
     </w:p>
     <w:p>
@@ -2444,80 +2596,20 @@
           <w:lang w:val="es-MX"/>
         </w:rPr>
       </w:pPr>
-      <w:proofErr w:type="spellStart"/>
-      <w:r>
-        <w:rPr>
-          <w:rStyle w:val="Textoennegrita"/>
-          <w:lang w:val="es-MX"/>
-        </w:rPr>
-        <w:t>Redis</w:t>
-      </w:r>
-      <w:proofErr w:type="spellEnd"/>
-      <w:r>
-        <w:rPr>
-          <w:rStyle w:val="Textoennegrita"/>
-          <w:lang w:val="es-MX"/>
-        </w:rPr>
-        <w:t xml:space="preserve"> con </w:t>
-      </w:r>
-      <w:proofErr w:type="spellStart"/>
-      <w:r>
-        <w:rPr>
-          <w:rStyle w:val="CdigoHTML"/>
-          <w:b/>
-          <w:bCs/>
-          <w:lang w:val="es-MX"/>
-        </w:rPr>
-        <w:t>setEx</w:t>
-      </w:r>
-      <w:proofErr w:type="spellEnd"/>
-      <w:r>
-        <w:rPr>
-          <w:lang w:val="es-MX"/>
-        </w:rPr>
-        <w:t xml:space="preserve"> — guarda la sesión con expiración de 8 horas, igual que el JWT. Eso permite hacer </w:t>
-      </w:r>
-      <w:proofErr w:type="spellStart"/>
-      <w:r>
-        <w:rPr>
-          <w:lang w:val="es-MX"/>
-        </w:rPr>
-        <w:t>logout</w:t>
-      </w:r>
-      <w:proofErr w:type="spellEnd"/>
-      <w:r>
-        <w:rPr>
-          <w:lang w:val="es-MX"/>
-        </w:rPr>
-        <w:t xml:space="preserve"> real invalidando la sesión en </w:t>
-      </w:r>
-      <w:proofErr w:type="spellStart"/>
-      <w:r>
-        <w:rPr>
-          <w:lang w:val="es-MX"/>
-        </w:rPr>
-        <w:t>Redis</w:t>
-      </w:r>
-      <w:proofErr w:type="spellEnd"/>
-      <w:r>
-        <w:rPr>
-          <w:lang w:val="es-MX"/>
-        </w:rPr>
-        <w:t xml:space="preserve"> sin esperar a que expire el </w:t>
-      </w:r>
-      <w:proofErr w:type="spellStart"/>
-      <w:r>
-        <w:rPr>
-          <w:lang w:val="es-MX"/>
-        </w:rPr>
-        <w:t>token</w:t>
-      </w:r>
-      <w:proofErr w:type="spellEnd"/>
-      <w:r>
-        <w:rPr>
-          <w:lang w:val="es-MX"/>
-        </w:rPr>
-        <w:t>.</w:t>
+      <w:r>
+        <w:rPr>
+          <w:rStyle w:val="CdigoHTML"/>
+          <w:b/>
+          <w:bCs/>
+          <w:lang w:val="es-MX"/>
+        </w:rPr>
+        <w:t>process.env.REDIS_URL || "redis://127.0.0.1:6379"</w:t>
+      </w:r>
+      <w:r>
+        <w:rPr>
+          <w:lang w:val="es-MX"/>
+        </w:rPr>
+        <w:t xml:space="preserve"> — si no hay variable de entorno, cae en localhost. Útil para desarrollo local sin Docker.</w:t>
       </w:r>
     </w:p>
     <w:p>
@@ -2534,225 +2626,7 @@
           <w:bCs/>
           <w:lang w:val="es-MX"/>
         </w:rPr>
-        <w:t>"0.0.0.0"</w:t>
-      </w:r>
-      <w:r>
-        <w:rPr>
-          <w:lang w:val="es-MX"/>
-        </w:rPr>
-        <w:t xml:space="preserve"> en </w:t>
-      </w:r>
-      <w:proofErr w:type="spellStart"/>
-      <w:proofErr w:type="gramStart"/>
-      <w:r>
-        <w:rPr>
-          <w:rStyle w:val="CdigoHTML"/>
-          <w:lang w:val="es-MX"/>
-        </w:rPr>
-        <w:t>app.listen</w:t>
-      </w:r>
-      <w:proofErr w:type="spellEnd"/>
-      <w:proofErr w:type="gramEnd"/>
-      <w:r>
-        <w:rPr>
-          <w:lang w:val="es-MX"/>
-        </w:rPr>
-        <w:t xml:space="preserve"> — escucha en todas las interfaces de red del contenedor, necesario para que </w:t>
-      </w:r>
-      <w:proofErr w:type="spellStart"/>
-      <w:r>
-        <w:rPr>
-          <w:lang w:val="es-MX"/>
-        </w:rPr>
-        <w:t>Docker</w:t>
-      </w:r>
-      <w:proofErr w:type="spellEnd"/>
-      <w:r>
-        <w:rPr>
-          <w:lang w:val="es-MX"/>
-        </w:rPr>
-        <w:t xml:space="preserve"> pueda </w:t>
-      </w:r>
-      <w:proofErr w:type="spellStart"/>
-      <w:r>
-        <w:rPr>
-          <w:lang w:val="es-MX"/>
-        </w:rPr>
-        <w:t>enrutar</w:t>
-      </w:r>
-      <w:proofErr w:type="spellEnd"/>
-      <w:r>
-        <w:rPr>
-          <w:lang w:val="es-MX"/>
-        </w:rPr>
-        <w:t xml:space="preserve"> tráfico hacia él.</w:t>
-      </w:r>
-    </w:p>
-    <w:p>
-      <w:pPr>
-        <w:pStyle w:val="Ttulo3"/>
-        <w:rPr>
-          <w:lang w:val="es-MX"/>
-        </w:rPr>
-      </w:pPr>
-      <w:proofErr w:type="gramStart"/>
-      <w:r>
-        <w:rPr>
-          <w:lang w:val="es-MX"/>
-        </w:rPr>
-        <w:t>Análisis línea</w:t>
-      </w:r>
-      <w:proofErr w:type="gramEnd"/>
-      <w:r>
-        <w:rPr>
-          <w:lang w:val="es-MX"/>
-        </w:rPr>
-        <w:t xml:space="preserve"> por línea </w:t>
-      </w:r>
-      <w:r>
-        <w:rPr>
-          <w:rFonts w:ascii="Segoe UI Symbol" w:hAnsi="Segoe UI Symbol" w:cs="Segoe UI Symbol"/>
-          <w:lang w:val="es-MX"/>
-        </w:rPr>
-        <w:t>✅</w:t>
-      </w:r>
-    </w:p>
-    <w:p>
-      <w:pPr>
-        <w:pStyle w:val="font-claude-response-body"/>
-        <w:rPr>
-          <w:lang w:val="es-MX"/>
-        </w:rPr>
-      </w:pPr>
-      <w:r>
-        <w:rPr>
-          <w:rStyle w:val="CdigoHTML"/>
-          <w:b/>
-          <w:bCs/>
-          <w:lang w:val="es-MX"/>
-        </w:rPr>
-        <w:t>let client</w:t>
-      </w:r>
-      <w:r>
-        <w:rPr>
-          <w:lang w:val="es-MX"/>
-        </w:rPr>
-        <w:t xml:space="preserve"> — variable que guarda la conexión. Al estar fuera de la función, persiste entre llamadas. No se crea una nueva conexión cada vez.</w:t>
-      </w:r>
-    </w:p>
-    <w:p>
-      <w:pPr>
-        <w:pStyle w:val="font-claude-response-body"/>
-        <w:rPr>
-          <w:lang w:val="es-MX"/>
-        </w:rPr>
-      </w:pPr>
-      <w:r>
-        <w:rPr>
-          <w:rStyle w:val="CdigoHTML"/>
-          <w:b/>
-          <w:bCs/>
-          <w:lang w:val="es-MX"/>
-        </w:rPr>
-        <w:t xml:space="preserve">if (client &amp;&amp; </w:t>
-      </w:r>
-      <w:proofErr w:type="gramStart"/>
-      <w:r>
-        <w:rPr>
-          <w:rStyle w:val="CdigoHTML"/>
-          <w:b/>
-          <w:bCs/>
-          <w:lang w:val="es-MX"/>
-        </w:rPr>
-        <w:t>client.isOpen</w:t>
-      </w:r>
-      <w:proofErr w:type="gramEnd"/>
-      <w:r>
-        <w:rPr>
-          <w:rStyle w:val="CdigoHTML"/>
-          <w:b/>
-          <w:bCs/>
-          <w:lang w:val="es-MX"/>
-        </w:rPr>
-        <w:t>) return client</w:t>
-      </w:r>
-      <w:r>
-        <w:rPr>
-          <w:lang w:val="es-MX"/>
-        </w:rPr>
-        <w:t xml:space="preserve"> — patrón </w:t>
-      </w:r>
-      <w:r>
-        <w:rPr>
-          <w:rStyle w:val="Textoennegrita"/>
-          <w:lang w:val="es-MX"/>
-        </w:rPr>
-        <w:t>Singleton</w:t>
-      </w:r>
-      <w:r>
-        <w:rPr>
-          <w:lang w:val="es-MX"/>
-        </w:rPr>
-        <w:t>. Si ya existe una conexión abierta, la reutiliza. Sin esto, cada petición al servidor abriría una conexión nueva y agotarías Redis rápidamente. Menciona este patrón en tu tesis.</w:t>
-      </w:r>
-    </w:p>
-    <w:p>
-      <w:pPr>
-        <w:pStyle w:val="font-claude-response-body"/>
-        <w:rPr>
-          <w:lang w:val="es-MX"/>
-        </w:rPr>
-      </w:pPr>
-      <w:proofErr w:type="gramStart"/>
-      <w:r>
-        <w:rPr>
-          <w:rStyle w:val="CdigoHTML"/>
-          <w:b/>
-          <w:bCs/>
-          <w:lang w:val="es-MX"/>
-        </w:rPr>
-        <w:t>process.env.REDIS</w:t>
-      </w:r>
-      <w:proofErr w:type="gramEnd"/>
-      <w:r>
-        <w:rPr>
-          <w:rStyle w:val="CdigoHTML"/>
-          <w:b/>
-          <w:bCs/>
-          <w:lang w:val="es-MX"/>
-        </w:rPr>
-        <w:t>_URL || "redis://127.0.0.1:6379"</w:t>
-      </w:r>
-      <w:r>
-        <w:rPr>
-          <w:lang w:val="es-MX"/>
-        </w:rPr>
-        <w:t xml:space="preserve"> — si no hay variable de entorno, cae en localhost. Útil para desarrollo local sin Docker.</w:t>
-      </w:r>
-    </w:p>
-    <w:p>
-      <w:pPr>
-        <w:pStyle w:val="font-claude-response-body"/>
-      </w:pPr>
-      <w:proofErr w:type="gramStart"/>
-      <w:r>
-        <w:rPr>
-          <w:rStyle w:val="CdigoHTML"/>
-          <w:b/>
-          <w:bCs/>
-          <w:lang w:val="es-MX"/>
-        </w:rPr>
-        <w:t>client.on</w:t>
-      </w:r>
-      <w:proofErr w:type="gramEnd"/>
-      <w:r>
-        <w:rPr>
-          <w:rStyle w:val="CdigoHTML"/>
-          <w:b/>
-          <w:bCs/>
-          <w:lang w:val="es-MX"/>
-        </w:rPr>
-        <w:t>("error", ...)</w:t>
+        <w:t>client.on("error", ...)</w:t>
       </w:r>
       <w:r>
         <w:rPr>
@@ -2761,63 +2635,88 @@
         <w:t xml:space="preserve"> — captura errores de Redis sin crashear el servidor. </w:t>
       </w:r>
       <w:r>
-        <w:t xml:space="preserve">El </w:t>
-      </w:r>
-      <w:proofErr w:type="spellStart"/>
-      <w:r>
-        <w:t>servicio</w:t>
-      </w:r>
-      <w:proofErr w:type="spellEnd"/>
-      <w:r>
-        <w:t xml:space="preserve"> </w:t>
-      </w:r>
-      <w:proofErr w:type="spellStart"/>
-      <w:r>
-        <w:t>sigue</w:t>
-      </w:r>
-      <w:proofErr w:type="spellEnd"/>
-      <w:r>
-        <w:t xml:space="preserve"> </w:t>
-      </w:r>
-      <w:proofErr w:type="spellStart"/>
-      <w:r>
-        <w:t>funcionando</w:t>
-      </w:r>
-      <w:proofErr w:type="spellEnd"/>
-      <w:r>
-        <w:t xml:space="preserve"> </w:t>
-      </w:r>
-      <w:proofErr w:type="spellStart"/>
-      <w:r>
-        <w:t>aunque</w:t>
-      </w:r>
-      <w:proofErr w:type="spellEnd"/>
-      <w:r>
-        <w:t xml:space="preserve"> </w:t>
-      </w:r>
-      <w:proofErr w:type="spellStart"/>
-      <w:r>
-        <w:t>Redis</w:t>
-      </w:r>
-      <w:proofErr w:type="spellEnd"/>
-      <w:r>
-        <w:t xml:space="preserve"> </w:t>
-      </w:r>
-      <w:proofErr w:type="spellStart"/>
-      <w:r>
-        <w:t>falle</w:t>
-      </w:r>
-      <w:proofErr w:type="spellEnd"/>
-      <w:r>
-        <w:t xml:space="preserve"> </w:t>
-      </w:r>
-      <w:proofErr w:type="spellStart"/>
-      <w:r>
-        <w:t>momentáneamente</w:t>
-      </w:r>
-      <w:proofErr w:type="spellEnd"/>
-      <w:r>
-        <w:t>.</w:t>
+        <w:rPr>
+          <w:lang w:val="es-MX"/>
+        </w:rPr>
+        <w:t>El servicio sigue funcionando aunque Redis falle momentáneamente.</w:t>
+      </w:r>
+    </w:p>
+    <w:p>
+      <w:pPr>
+        <w:spacing w:beforeAutospacing="1" w:after="100" w:afterAutospacing="1" w:line="240" w:lineRule="auto"/>
+        <w:rPr>
+          <w:rFonts w:ascii="Times New Roman" w:eastAsia="Times New Roman" w:hAnsi="Times New Roman" w:cs="Times New Roman"/>
+          <w:sz w:val="24"/>
+          <w:szCs w:val="24"/>
+          <w:lang w:val="es-MX"/>
+        </w:rPr>
+      </w:pPr>
+      <w:r>
+        <w:rPr>
+          <w:rFonts w:ascii="Times New Roman" w:eastAsia="Times New Roman" w:hAnsi="Times New Roman" w:cs="Times New Roman"/>
+          <w:sz w:val="24"/>
+          <w:szCs w:val="24"/>
+          <w:lang w:val="es-MX"/>
+        </w:rPr>
+        <w:t xml:space="preserve">Un UUID como </w:t>
+      </w:r>
+      <w:r>
+        <w:rPr>
+          <w:rFonts w:ascii="Courier New" w:eastAsia="Times New Roman" w:hAnsi="Courier New" w:cs="Courier New"/>
+          <w:sz w:val="20"/>
+          <w:szCs w:val="20"/>
+          <w:lang w:val="es-MX"/>
+        </w:rPr>
+        <w:t>b914a2e5-e920-4826-ac6d-a3b03d633776</w:t>
+      </w:r>
+      <w:r>
+        <w:rPr>
+          <w:rFonts w:ascii="Times New Roman" w:eastAsia="Times New Roman" w:hAnsi="Times New Roman" w:cs="Times New Roman"/>
+          <w:sz w:val="24"/>
+          <w:szCs w:val="24"/>
+          <w:lang w:val="es-MX"/>
+        </w:rPr>
+        <w:t xml:space="preserve"> es único en el universo. Si algún día tienes varios servidores creando usuarios simultáneamente, nunca habrá colisión de IDs. Un número simple (1, 2, 3...) requeriría coordinar con la base de datos para saber cuál toca, lo cual es un cuello de botella.</w:t>
+      </w:r>
+    </w:p>
+    <w:p>
+      <w:pPr>
+        <w:spacing w:before="100" w:beforeAutospacing="1" w:after="100" w:afterAutospacing="1" w:line="240" w:lineRule="auto"/>
+        <w:rPr>
+          <w:rFonts w:ascii="Times New Roman" w:eastAsia="Times New Roman" w:hAnsi="Times New Roman" w:cs="Times New Roman"/>
+          <w:sz w:val="24"/>
+          <w:szCs w:val="24"/>
+          <w:lang w:val="es-MX"/>
+        </w:rPr>
+      </w:pPr>
+      <w:r>
+        <w:rPr>
+          <w:rFonts w:ascii="Times New Roman" w:eastAsia="Times New Roman" w:hAnsi="Times New Roman" w:cs="Times New Roman"/>
+          <w:sz w:val="24"/>
+          <w:szCs w:val="24"/>
+          <w:lang w:val="es-MX"/>
+        </w:rPr>
+        <w:t xml:space="preserve">Y ese token largo es tu </w:t>
+      </w:r>
+      <w:r>
+        <w:rPr>
+          <w:rFonts w:ascii="Times New Roman" w:eastAsia="Times New Roman" w:hAnsi="Times New Roman" w:cs="Times New Roman"/>
+          <w:b/>
+          <w:bCs/>
+          <w:sz w:val="24"/>
+          <w:szCs w:val="24"/>
+          <w:lang w:val="es-MX"/>
+        </w:rPr>
+        <w:t>JWT</w:t>
+      </w:r>
+      <w:r>
+        <w:rPr>
+          <w:rFonts w:ascii="Times New Roman" w:eastAsia="Times New Roman" w:hAnsi="Times New Roman" w:cs="Times New Roman"/>
+          <w:sz w:val="24"/>
+          <w:szCs w:val="24"/>
+          <w:lang w:val="es-MX"/>
+        </w:rPr>
+        <w:t xml:space="preserve"> — contiene la identidad del usuario encriptada.</w:t>
       </w:r>
     </w:p>
     <w:p>
@@ -2847,14 +2746,7 @@
         <w:rPr>
           <w:lang w:val="es-MX"/>
         </w:rPr>
-        <w:t xml:space="preserve">Necesito hacer una APP que contenga una IA que funcione offline que sirva para recibir historias clínicas de un consultorio optometrista, cuando tenga conexión deberá sincronizar con una base de datos que ya tengo configurada en Mongo Atlas. Me vas a explicar paso por paso porque es para mi tesis y necesito saber TODO y auditar todo. Me ayudas a fabricar el código y me explicas </w:t>
-      </w:r>
-      <w:r>
-        <w:rPr>
-          <w:lang w:val="es-MX"/>
-        </w:rPr>
-        <w:lastRenderedPageBreak/>
-        <w:t xml:space="preserve">línea por línea dándome maneras creativas de realizar para que yo pueda aprender y asimismo aprobar. Necesito también subir este proyecto cada progreso que haga al </w:t>
+        <w:t xml:space="preserve">Necesito hacer una APP que contenga una IA que funcione offline que sirva para recibir historias clínicas de un consultorio optometrista, cuando tenga conexión deberá sincronizar con una base de datos que ya tengo configurada en Mongo Atlas. Me vas a explicar paso por paso porque es para mi tesis y necesito saber TODO y auditar todo. Me ayudas a fabricar el código y me explicas línea por línea dándome maneras creativas de realizar para que yo pueda aprender y asimismo aprobar. Necesito también subir este proyecto cada progreso que haga al </w:t>
       </w:r>
       <w:proofErr w:type="spellStart"/>
       <w:r>
@@ -3498,6 +3390,7 @@
         <w:rPr>
           <w:lang w:val="es-MX"/>
         </w:rPr>
+        <w:lastRenderedPageBreak/>
         <w:t>Esta es la capacidad más crítica para tu evaluación. La app debe funcionar sin conexión y sincronizarse al detectar red.</w:t>
       </w:r>
     </w:p>
@@ -3639,7 +3532,6 @@
           <w:bCs/>
           <w:lang w:val="es-MX"/>
         </w:rPr>
-        <w:lastRenderedPageBreak/>
         <w:t>Resolución de Conflictos:</w:t>
       </w:r>
       <w:r>

</xml_diff>